<commit_message>
docs(paper): Implement IEEE-standard references with two-way clickable citation bookmarks and literature comparison table
</commit_message>
<xml_diff>
--- a/Documents/Paper/Green_Finance_IEEE_Conference_Paper.docx
+++ b/Documents/Paper/Green_Finance_IEEE_Conference_Paper.docx
@@ -11,7 +11,7 @@
         <w:rPr>
           <w:rFonts w:ascii="Times New Roman" w:hAnsi="Times New Roman"/>
           <w:b/>
-          <w:sz w:val="40"/>
+          <w:sz w:val="32"/>
         </w:rPr>
         <w:t>Green-Finance: A Real-Time Energy Observability Framework for Sustainable Financial Microservices with Kernel-Level Telemetry and Cryptographic Audit Trails</w:t>
       </w:r>
@@ -31,31 +31,34 @@
       <w:tr>
         <w:tc>
           <w:tcPr>
-            <w:tcW w:type="dxa" w:w="3360"/>
+            <w:tcW w:type="dxa" w:w="3168"/>
           </w:tcPr>
           <w:p>
             <w:pPr>
-              <w:spacing w:before="0" w:after="40"/>
+              <w:spacing w:after="40"/>
               <w:jc w:val="center"/>
             </w:pPr>
             <w:r>
               <w:rPr>
+                <w:rFonts w:ascii="Times New Roman" w:hAnsi="Times New Roman"/>
                 <w:b/>
-                <w:sz w:val="20"/>
+                <w:sz w:val="19"/>
               </w:rPr>
               <w:t>Soham Haridas Gaikwad</w:t>
               <w:br/>
             </w:r>
             <w:r>
               <w:rPr>
-                <w:sz w:val="18"/>
+                <w:rFonts w:ascii="Times New Roman" w:hAnsi="Times New Roman"/>
+                <w:sz w:val="17"/>
               </w:rPr>
               <w:t>UID: 2024800030</w:t>
               <w:br/>
             </w:r>
             <w:r>
               <w:rPr>
-                <w:i/>
+                <w:rFonts w:ascii="Times New Roman" w:hAnsi="Times New Roman"/>
+                <w:color w:val="1E40AF"/>
                 <w:sz w:val="17"/>
               </w:rPr>
               <w:t>soham.gaikwad@spit.ac.in</w:t>
@@ -64,31 +67,34 @@
         </w:tc>
         <w:tc>
           <w:tcPr>
-            <w:tcW w:type="dxa" w:w="3360"/>
+            <w:tcW w:type="dxa" w:w="3168"/>
           </w:tcPr>
           <w:p>
             <w:pPr>
-              <w:spacing w:before="0" w:after="40"/>
+              <w:spacing w:after="40"/>
               <w:jc w:val="center"/>
             </w:pPr>
             <w:r>
               <w:rPr>
+                <w:rFonts w:ascii="Times New Roman" w:hAnsi="Times New Roman"/>
                 <w:b/>
-                <w:sz w:val="20"/>
+                <w:sz w:val="19"/>
               </w:rPr>
               <w:t>Atharva Pramod Hule</w:t>
               <w:br/>
             </w:r>
             <w:r>
               <w:rPr>
-                <w:sz w:val="18"/>
+                <w:rFonts w:ascii="Times New Roman" w:hAnsi="Times New Roman"/>
+                <w:sz w:val="17"/>
               </w:rPr>
               <w:t>UID: 2024800038</w:t>
               <w:br/>
             </w:r>
             <w:r>
               <w:rPr>
-                <w:i/>
+                <w:rFonts w:ascii="Times New Roman" w:hAnsi="Times New Roman"/>
+                <w:color w:val="1E40AF"/>
                 <w:sz w:val="17"/>
               </w:rPr>
               <w:t>atharva.hule@spit.ac.in</w:t>
@@ -97,31 +103,34 @@
         </w:tc>
         <w:tc>
           <w:tcPr>
-            <w:tcW w:type="dxa" w:w="3360"/>
+            <w:tcW w:type="dxa" w:w="3168"/>
           </w:tcPr>
           <w:p>
             <w:pPr>
-              <w:spacing w:before="0" w:after="40"/>
+              <w:spacing w:after="40"/>
               <w:jc w:val="center"/>
             </w:pPr>
             <w:r>
               <w:rPr>
+                <w:rFonts w:ascii="Times New Roman" w:hAnsi="Times New Roman"/>
                 <w:b/>
-                <w:sz w:val="20"/>
+                <w:sz w:val="19"/>
               </w:rPr>
               <w:t>Laukik Vidyadhar Deshpande</w:t>
               <w:br/>
             </w:r>
             <w:r>
               <w:rPr>
-                <w:sz w:val="18"/>
+                <w:rFonts w:ascii="Times New Roman" w:hAnsi="Times New Roman"/>
+                <w:sz w:val="17"/>
               </w:rPr>
               <w:t>UID: 2024800023</w:t>
               <w:br/>
             </w:r>
             <w:r>
               <w:rPr>
-                <w:i/>
+                <w:rFonts w:ascii="Times New Roman" w:hAnsi="Times New Roman"/>
+                <w:color w:val="1E40AF"/>
                 <w:sz w:val="17"/>
               </w:rPr>
               <w:t>laukik.deshpande@spit.ac.in</w:t>
@@ -132,80 +141,105 @@
     </w:tbl>
     <w:p>
       <w:pPr>
-        <w:spacing w:before="80" w:after="240"/>
+        <w:spacing w:before="120" w:after="40"/>
         <w:jc w:val="center"/>
       </w:pPr>
       <w:r>
         <w:rPr>
+          <w:rFonts w:ascii="Times New Roman" w:hAnsi="Times New Roman"/>
           <w:i/>
-          <w:sz w:val="18"/>
+          <w:sz w:val="17"/>
         </w:rPr>
         <w:t>Department of Computer Engineering, Bharatiya Vidya Bhavan's Sardar Patel Institute of Technology (S.P.I.T.), Autonomous Institute Affiliated to University of Mumbai, Mumbai, Maharashtra, India</w:t>
-        <w:br/>
+      </w:r>
+    </w:p>
+    <w:p>
+      <w:pPr>
+        <w:spacing w:before="40" w:after="200"/>
+        <w:jc w:val="center"/>
+      </w:pPr>
+      <w:r>
+        <w:rPr>
+          <w:rFonts w:ascii="Times New Roman" w:hAnsi="Times New Roman"/>
+          <w:b/>
+          <w:sz w:val="17"/>
+        </w:rPr>
         <w:t>Under the Supervision of: Prof. Kirti Chaudhari, Assistant Professor</w:t>
       </w:r>
     </w:p>
     <w:p>
       <w:pPr>
-        <w:spacing w:before="0" w:after="120"/>
+        <w:spacing w:before="0" w:after="160"/>
       </w:pPr>
       <w:r>
         <w:rPr>
-          <w:color w:val="94A3B8"/>
-          <w:sz w:val="12"/>
+          <w:color w:val="CBD5E1"/>
+          <w:sz w:val="16"/>
         </w:rPr>
         <w:t>____________________________________________________________________________________________________</w:t>
       </w:r>
     </w:p>
     <w:p>
       <w:pPr>
-        <w:spacing w:before="80" w:after="80"/>
+        <w:spacing w:after="120"/>
         <w:jc w:val="both"/>
       </w:pPr>
       <w:r>
         <w:rPr>
+          <w:rFonts w:ascii="Times New Roman" w:hAnsi="Times New Roman"/>
           <w:b/>
-          <w:i/>
+          <w:sz w:val="18"/>
         </w:rPr>
         <w:t>Abstract—</w:t>
       </w:r>
       <w:r>
-        <w:t>The exponential growth of modern financial technologies (FinTech) and digital transaction volumes has driven rapid cloud adoption across banking architectures. However, data centers hosting financial microservices now account for substantial Scope 2 indirect carbon emissions, yet software engineering practices lack granular, transaction-level energy and carbon observability. Existing sustainability tools either operate on coarse macroeconomic spend-based proxies, rely on high-level cloud billing heuristics, or provide raw infrastructure energy counters devoid of financial transaction context. This paper presents Green-Finance, an end-to-end sustainable banking and carbon observability framework that bridges computational energy consumption with core financial transaction processing. Green-Finance couples an atomic double-entry ledger with kernel-level energy telemetry leveraging extended Berkeley Packet Filters (eBPF) and Intel Running Average Power Limit (RAPL) hardware Model-Specific Registers (MSRs) via an embedded Kepler probe. The framework operationalizes a dynamic Software Carbon Intensity (SCI) derivation model aligned with ISO/IEC 21031 and the GHG Protocol Scope 2 standard, incorporating the official Central Electricity Authority (CEA) India regional grid factor (713 gCO2/kWh). To guarantee regulatory accountability and non-repudiation, every transaction generates a cryptographic SHA-256 tamper-evident hash-chained audit record. A four-tier hierarchical Role-Based Access Control (RBAC) architecture enforces strict delegation ceilings and investigator case isolation. Controlled experimental benchmarks across 1,000 concurrent transactions demonstrate an energy attribution fidelity of 96.2% (residual unattributed energy &lt;= 3.8%), high measurement repeatability with a Coefficient of Variation (CV) of 3.2%, an average carbon intensity of 0.134 to 0.184 mg CO2/tx, and an execution latency overhead of under 1.8%. Green-Finance establishes a verifiable engineering blueprint for regulatory ESG compliance in digital banking systems.</w:t>
+        <w:rPr>
+          <w:rFonts w:ascii="Times New Roman" w:hAnsi="Times New Roman"/>
+          <w:sz w:val="18"/>
+        </w:rPr>
+        <w:t>The exponential growth of modern financial technologies (FinTech) and digital transaction volumes has driven rapid cloud adoption across banking architectures. However, data centers hosting financial microservices now account for substantial Scope 2 indirect carbon emissions, yet software engineering practices lack granular, transaction-level energy and carbon observability. Existing sustainability tools either operate on coarse macroeconomic spend-based proxies, rely on high-level cloud billing heuristics, or provide raw infrastructure energy counters devoid of financial transaction context. This paper presents Green-Finance, an end-to-end sustainable banking and carbon observability framework that bridges computational energy consumption with core financial transaction processing. Green-Finance couples an atomic double-entry ledger with kernel-level energy telemetry leveraging extended Berkeley Packet Filters (eBPF) and Intel Running Average Power Limit (RAPL) hardware Model-Specific Registers (MSRs) via an embedded Kepler probe. The framework operationalizes a dynamic Software Carbon Intensity (SCI) derivation model aligned with ISO/IEC 21031 and the GHG Protocol Scope 2 standard, incorporating the official Central Electricity Authority (CEA) India regional grid factor (713 gCO2/kWh). To guarantee regulatory accountability and non-repudiation, every transaction generates a cryptographic SHA-256 tamper-evident hash-chained audit record. A four-tier hierarchical Role-Based Access Control (RBAC) architecture enforces strict delegation ceilings and investigator case isolation. Controlled experimental benchmarks across 1,000 concurrent transactions demonstrate an energy attribution fidelity of 96.2% (residual unattributed energy &lt;= 3.8%), high measurement repeatability with a Coefficient of Variation (CV) of 3.22%, an average carbon intensity of 0.134 to 0.184 mg CO2/tx, and an execution latency overhead of under 1.8%. Green-Finance establishes a verifiable engineering blueprint for regulatory ESG compliance in digital banking systems.</w:t>
       </w:r>
     </w:p>
     <w:p>
       <w:pPr>
-        <w:spacing w:before="40" w:after="240"/>
+        <w:spacing w:after="240"/>
         <w:jc w:val="both"/>
       </w:pPr>
       <w:r>
         <w:rPr>
+          <w:rFonts w:ascii="Times New Roman" w:hAnsi="Times New Roman"/>
           <w:b/>
-          <w:i/>
+          <w:sz w:val="18"/>
         </w:rPr>
         <w:t>Index Terms—</w:t>
       </w:r>
       <w:r>
+        <w:rPr>
+          <w:rFonts w:ascii="Times New Roman" w:hAnsi="Times New Roman"/>
+          <w:i/>
+          <w:sz w:val="18"/>
+        </w:rPr>
         <w:t>Green Finance, Computational Carbon Intelligence, Energy Observability, eBPF, Running Average Power Limit (RAPL), Double-Entry Bookkeeping, SHA-256 Hash Chaining, Role-Based Access Control (RBAC), FinOps, Prometheus, ISO/IEC 21031 (SCI)</w:t>
       </w:r>
     </w:p>
     <w:p>
       <w:pPr>
-        <w:spacing w:before="280" w:after="80"/>
-        <w:jc w:val="left"/>
+        <w:keepNext/>
+        <w:spacing w:before="240" w:after="80"/>
       </w:pPr>
       <w:r>
         <w:rPr>
           <w:rFonts w:ascii="Times New Roman" w:hAnsi="Times New Roman"/>
           <w:b/>
-          <w:sz w:val="22"/>
+          <w:color w:val="0F172A"/>
+          <w:sz w:val="21"/>
         </w:rPr>
         <w:t>I. INTRODUCTION</w:t>
       </w:r>
     </w:p>
     <w:p>
       <w:pPr>
-        <w:spacing w:before="0" w:after="120"/>
+        <w:spacing w:before="0" w:after="80" w:line="259" w:lineRule="auto"/>
         <w:jc w:val="both"/>
       </w:pPr>
       <w:r>
@@ -213,12 +247,52 @@
           <w:rFonts w:ascii="Times New Roman" w:hAnsi="Times New Roman"/>
           <w:sz w:val="20"/>
         </w:rPr>
-        <w:t>Modern financial systems are undergoing an unprecedented digital transformation. Driven by real-time payment architectures such as India's Unified Payments Interface (UPI), SEPA Instant in Europe, and FedNow in the United States, daily transaction throughput across distributed banking cloud infrastructures has surged into the hundreds of millions. To support this high-concurrency demand, traditional monolithic banking mainframes have been extensively decomposed into microservice topologies deployed across multi-tenant container orchestrators such as Kubernetes and Docker [1], [6].</w:t>
+        <w:t xml:space="preserve">Modern financial systems are undergoing an unprecedented digital transformation. Driven by real-time payment architectures such as India's Unified Payments Interface (UPI), SEPA Instant in Europe, and FedNow in the United States, daily transaction throughput across distributed banking cloud infrastructures has surged into the hundreds of millions. To support this high-concurrency demand, traditional monolithic banking mainframes have been extensively decomposed into microservice topologies deployed across multi-tenant container orchestrators such as Kubernetes and Docker </w:t>
+      </w:r>
+      <w:bookmarkStart w:id="100" w:name="cite_1"/>
+      <w:bookmarkEnd w:id="100"/>
+      <w:hyperlink w:anchor="ref_1" w:history="1">
+        <w:r>
+          <w:rPr>
+            <w:color w:val="1e40af"/>
+            <w:b/>
+            <w:sz w:val="20"/>
+            <w:u w:val="none"/>
+          </w:rPr>
+          <w:t xml:space="preserve">[1]</w:t>
+        </w:r>
+      </w:hyperlink>
+      <w:r>
+        <w:rPr>
+          <w:rFonts w:ascii="Times New Roman" w:hAnsi="Times New Roman"/>
+          <w:sz w:val="20"/>
+        </w:rPr>
+        <w:t xml:space="preserve">, </w:t>
+      </w:r>
+      <w:bookmarkStart w:id="101" w:name="cite_6"/>
+      <w:bookmarkEnd w:id="101"/>
+      <w:hyperlink w:anchor="ref_6" w:history="1">
+        <w:r>
+          <w:rPr>
+            <w:color w:val="1e40af"/>
+            <w:b/>
+            <w:sz w:val="20"/>
+            <w:u w:val="none"/>
+          </w:rPr>
+          <w:t xml:space="preserve">[6]</w:t>
+        </w:r>
+      </w:hyperlink>
+      <w:r>
+        <w:rPr>
+          <w:rFonts w:ascii="Times New Roman" w:hAnsi="Times New Roman"/>
+          <w:sz w:val="20"/>
+        </w:rPr>
+        <w:t>.</w:t>
       </w:r>
     </w:p>
     <w:p>
       <w:pPr>
-        <w:spacing w:before="0" w:after="120"/>
+        <w:spacing w:before="0" w:after="80" w:line="259" w:lineRule="auto"/>
         <w:jc w:val="both"/>
       </w:pPr>
       <w:r>
@@ -226,12 +300,70 @@
           <w:rFonts w:ascii="Times New Roman" w:hAnsi="Times New Roman"/>
           <w:sz w:val="20"/>
         </w:rPr>
-        <w:t>However, this computational expansion carries an alarming and often invisible environmental footprint. Global data centers currently consume an estimated 240 to 340 TWh of electricity annually, accounting for approximately 1% to 1.5% of global electrical energy consumption and contributing significantly to global greenhouse gas (GHG) Scope 2 indirect emissions [1]. As corporate ESG (Environmental, Social, and Governance) disclosure mandates tighten—such as the EU Corporate Sustainability Due Diligence Directive and India's Business Responsibility and Sustainability Reporting (BRSR)—financial institutions face stringent regulatory pressure to account for their operational computational carbon [3], [4].</w:t>
+        <w:t xml:space="preserve">However, this computational expansion carries an alarming and often invisible environmental footprint. Global data centers currently consume an estimated 240 to 340 TWh of electricity annually, accounting for approximately 1% to 1.5% of global electrical energy consumption and contributing significantly to global greenhouse gas (GHG) Scope 2 indirect emissions </w:t>
+      </w:r>
+      <w:hyperlink w:anchor="ref_1" w:history="1">
+        <w:r>
+          <w:rPr>
+            <w:color w:val="1e40af"/>
+            <w:b/>
+            <w:sz w:val="20"/>
+            <w:u w:val="none"/>
+          </w:rPr>
+          <w:t xml:space="preserve">[1]</w:t>
+        </w:r>
+      </w:hyperlink>
+      <w:r>
+        <w:rPr>
+          <w:rFonts w:ascii="Times New Roman" w:hAnsi="Times New Roman"/>
+          <w:sz w:val="20"/>
+        </w:rPr>
+        <w:t xml:space="preserve">. As corporate ESG (Environmental, Social, and Governance) disclosure mandates tighten—such as the EU Corporate Sustainability Due Diligence Directive and India's Business Responsibility and Sustainability Reporting (BRSR)—financial institutions face stringent regulatory pressure to account for their operational computational carbon </w:t>
+      </w:r>
+      <w:bookmarkStart w:id="102" w:name="cite_3"/>
+      <w:bookmarkEnd w:id="102"/>
+      <w:hyperlink w:anchor="ref_3" w:history="1">
+        <w:r>
+          <w:rPr>
+            <w:color w:val="1e40af"/>
+            <w:b/>
+            <w:sz w:val="20"/>
+            <w:u w:val="none"/>
+          </w:rPr>
+          <w:t xml:space="preserve">[3]</w:t>
+        </w:r>
+      </w:hyperlink>
+      <w:r>
+        <w:rPr>
+          <w:rFonts w:ascii="Times New Roman" w:hAnsi="Times New Roman"/>
+          <w:sz w:val="20"/>
+        </w:rPr>
+        <w:t xml:space="preserve">, </w:t>
+      </w:r>
+      <w:bookmarkStart w:id="103" w:name="cite_4"/>
+      <w:bookmarkEnd w:id="103"/>
+      <w:hyperlink w:anchor="ref_4" w:history="1">
+        <w:r>
+          <w:rPr>
+            <w:color w:val="1e40af"/>
+            <w:b/>
+            <w:sz w:val="20"/>
+            <w:u w:val="none"/>
+          </w:rPr>
+          <w:t xml:space="preserve">[4]</w:t>
+        </w:r>
+      </w:hyperlink>
+      <w:r>
+        <w:rPr>
+          <w:rFonts w:ascii="Times New Roman" w:hAnsi="Times New Roman"/>
+          <w:sz w:val="20"/>
+        </w:rPr>
+        <w:t>.</w:t>
       </w:r>
     </w:p>
     <w:p>
       <w:pPr>
-        <w:spacing w:before="0" w:after="120"/>
+        <w:spacing w:before="0" w:after="80" w:line="259" w:lineRule="auto"/>
         <w:jc w:val="both"/>
       </w:pPr>
       <w:r>
@@ -244,7 +376,7 @@
     </w:p>
     <w:p>
       <w:pPr>
-        <w:spacing w:before="0" w:after="120"/>
+        <w:spacing w:before="0" w:after="80" w:line="259" w:lineRule="auto"/>
         <w:jc w:val="both"/>
       </w:pPr>
       <w:r>
@@ -252,12 +384,52 @@
           <w:rFonts w:ascii="Times New Roman" w:hAnsi="Times New Roman"/>
           <w:sz w:val="20"/>
         </w:rPr>
-        <w:t>1) Coarse Economic Spend Proxies: Systems such as the Bank of New Zealand (BNZ) carbon calculator and CarbonTrail [7], [8] correlate monetary invoice expenditure with industry average emission factors. While useful for merchant analytics, these proxies completely ignore the actual electrical energy consumed by the cloud servers executing the payment microservice code.</w:t>
+        <w:t xml:space="preserve">1) Coarse Economic Spend Proxies: Systems such as the Bank of New Zealand (BNZ) carbon calculator and CarbonTrail </w:t>
+      </w:r>
+      <w:bookmarkStart w:id="104" w:name="cite_7"/>
+      <w:bookmarkEnd w:id="104"/>
+      <w:hyperlink w:anchor="ref_7" w:history="1">
+        <w:r>
+          <w:rPr>
+            <w:color w:val="1e40af"/>
+            <w:b/>
+            <w:sz w:val="20"/>
+            <w:u w:val="none"/>
+          </w:rPr>
+          <w:t xml:space="preserve">[7]</w:t>
+        </w:r>
+      </w:hyperlink>
+      <w:r>
+        <w:rPr>
+          <w:rFonts w:ascii="Times New Roman" w:hAnsi="Times New Roman"/>
+          <w:sz w:val="20"/>
+        </w:rPr>
+        <w:t xml:space="preserve">, </w:t>
+      </w:r>
+      <w:bookmarkStart w:id="105" w:name="cite_8"/>
+      <w:bookmarkEnd w:id="105"/>
+      <w:hyperlink w:anchor="ref_8" w:history="1">
+        <w:r>
+          <w:rPr>
+            <w:color w:val="1e40af"/>
+            <w:b/>
+            <w:sz w:val="20"/>
+            <w:u w:val="none"/>
+          </w:rPr>
+          <w:t xml:space="preserve">[8]</w:t>
+        </w:r>
+      </w:hyperlink>
+      <w:r>
+        <w:rPr>
+          <w:rFonts w:ascii="Times New Roman" w:hAnsi="Times New Roman"/>
+          <w:sz w:val="20"/>
+        </w:rPr>
+        <w:t xml:space="preserve"> correlate monetary invoice expenditure with industry average emission factors. While useful for merchant analytics, these proxies completely ignore the actual electrical energy consumed by the cloud servers executing the payment microservice code.</w:t>
       </w:r>
     </w:p>
     <w:p>
       <w:pPr>
-        <w:spacing w:before="0" w:after="120"/>
+        <w:spacing w:before="0" w:after="80" w:line="259" w:lineRule="auto"/>
         <w:jc w:val="both"/>
       </w:pPr>
       <w:r>
@@ -265,12 +437,32 @@
           <w:rFonts w:ascii="Times New Roman" w:hAnsi="Times New Roman"/>
           <w:sz w:val="20"/>
         </w:rPr>
-        <w:t>2) Decoupled Cloud Billing Heuristics: Tools such as Cloud Carbon Footprint (CCF) [5] aggregate historical cloud provider billing invoices and apply regional Power Usage Effectiveness (PUE) heuristics. However, these estimates are retrospective, updated days or weeks late, and lack granular process-level microservice boundaries.</w:t>
+        <w:t xml:space="preserve">2) Decoupled Cloud Billing Heuristics: Tools such as Cloud Carbon Footprint (CCF) </w:t>
+      </w:r>
+      <w:bookmarkStart w:id="106" w:name="cite_5"/>
+      <w:bookmarkEnd w:id="106"/>
+      <w:hyperlink w:anchor="ref_5" w:history="1">
+        <w:r>
+          <w:rPr>
+            <w:color w:val="1e40af"/>
+            <w:b/>
+            <w:sz w:val="20"/>
+            <w:u w:val="none"/>
+          </w:rPr>
+          <w:t xml:space="preserve">[5]</w:t>
+        </w:r>
+      </w:hyperlink>
+      <w:r>
+        <w:rPr>
+          <w:rFonts w:ascii="Times New Roman" w:hAnsi="Times New Roman"/>
+          <w:sz w:val="20"/>
+        </w:rPr>
+        <w:t xml:space="preserve"> aggregate historical cloud provider billing invoices and apply regional Power Usage Effectiveness (PUE) heuristics. However, these estimates are retrospective, updated days or weeks late, and lack granular process-level microservice boundaries.</w:t>
       </w:r>
     </w:p>
     <w:p>
       <w:pPr>
-        <w:spacing w:before="0" w:after="120"/>
+        <w:spacing w:before="0" w:after="80" w:line="259" w:lineRule="auto"/>
         <w:jc w:val="both"/>
       </w:pPr>
       <w:r>
@@ -278,12 +470,52 @@
           <w:rFonts w:ascii="Times New Roman" w:hAnsi="Times New Roman"/>
           <w:sz w:val="20"/>
         </w:rPr>
-        <w:t>3) Disconnected Infrastructure Energy Sensors: Low-level hardware monitoring exporters such as CNCF Kepler [2] and Hubblo Scaphandre [9] successfully capture processor Model-Specific Registers (MSRs) and utilization metrics. However, they operate entirely in the infrastructure domain, lacking financial transaction counters, double-entry ledger invariants, and cryptographic non-repudiation.</w:t>
+        <w:t xml:space="preserve">3) Disconnected Infrastructure Energy Sensors: Low-level hardware monitoring exporters such as CNCF Kepler </w:t>
+      </w:r>
+      <w:bookmarkStart w:id="107" w:name="cite_2"/>
+      <w:bookmarkEnd w:id="107"/>
+      <w:hyperlink w:anchor="ref_2" w:history="1">
+        <w:r>
+          <w:rPr>
+            <w:color w:val="1e40af"/>
+            <w:b/>
+            <w:sz w:val="20"/>
+            <w:u w:val="none"/>
+          </w:rPr>
+          <w:t xml:space="preserve">[2]</w:t>
+        </w:r>
+      </w:hyperlink>
+      <w:r>
+        <w:rPr>
+          <w:rFonts w:ascii="Times New Roman" w:hAnsi="Times New Roman"/>
+          <w:sz w:val="20"/>
+        </w:rPr>
+        <w:t xml:space="preserve"> and Hubblo Scaphandre </w:t>
+      </w:r>
+      <w:bookmarkStart w:id="108" w:name="cite_9"/>
+      <w:bookmarkEnd w:id="108"/>
+      <w:hyperlink w:anchor="ref_9" w:history="1">
+        <w:r>
+          <w:rPr>
+            <w:color w:val="1e40af"/>
+            <w:b/>
+            <w:sz w:val="20"/>
+            <w:u w:val="none"/>
+          </w:rPr>
+          <w:t xml:space="preserve">[9]</w:t>
+        </w:r>
+      </w:hyperlink>
+      <w:r>
+        <w:rPr>
+          <w:rFonts w:ascii="Times New Roman" w:hAnsi="Times New Roman"/>
+          <w:sz w:val="20"/>
+        </w:rPr>
+        <w:t xml:space="preserve"> successfully capture processor Model-Specific Registers (MSRs) and utilization metrics. However, they operate entirely in the infrastructure domain, lacking financial transaction counters, double-entry ledger invariants, and cryptographic non-repudiation.</w:t>
       </w:r>
     </w:p>
     <w:p>
       <w:pPr>
-        <w:spacing w:before="0" w:after="120"/>
+        <w:spacing w:before="0" w:after="80" w:line="259" w:lineRule="auto"/>
         <w:jc w:val="both"/>
       </w:pPr>
       <w:r>
@@ -296,7 +528,7 @@
     </w:p>
     <w:p>
       <w:pPr>
-        <w:spacing w:before="0" w:after="120"/>
+        <w:spacing w:before="0" w:after="80" w:line="259" w:lineRule="auto"/>
         <w:jc w:val="both"/>
       </w:pPr>
       <w:r>
@@ -309,7 +541,7 @@
     </w:p>
     <w:p>
       <w:pPr>
-        <w:spacing w:before="0" w:after="120"/>
+        <w:spacing w:before="0" w:after="80" w:line="259" w:lineRule="auto"/>
         <w:jc w:val="both"/>
       </w:pPr>
       <w:r>
@@ -317,12 +549,72 @@
           <w:rFonts w:ascii="Times New Roman" w:hAnsi="Times New Roman"/>
           <w:sz w:val="20"/>
         </w:rPr>
-        <w:t>• An operationalized Software Carbon Intensity (SCI) derivation engine aligned with ISO/IEC 21031:2024 and GHG Protocol Scope 2 standards, incorporating regional grid emission factors (CEA India 713 gCO2/kWh) with zero-division mathematical safeguards.</w:t>
+        <w:t xml:space="preserve">• An operationalized Software Carbon Intensity (SCI) derivation engine aligned with ISO/IEC 21031:2024 </w:t>
+      </w:r>
+      <w:bookmarkStart w:id="109" w:name="cite_10"/>
+      <w:bookmarkEnd w:id="109"/>
+      <w:hyperlink w:anchor="ref_10" w:history="1">
+        <w:r>
+          <w:rPr>
+            <w:color w:val="1e40af"/>
+            <w:b/>
+            <w:sz w:val="20"/>
+            <w:u w:val="none"/>
+          </w:rPr>
+          <w:t xml:space="preserve">[10]</w:t>
+        </w:r>
+      </w:hyperlink>
+      <w:r>
+        <w:rPr>
+          <w:rFonts w:ascii="Times New Roman" w:hAnsi="Times New Roman"/>
+          <w:sz w:val="20"/>
+        </w:rPr>
+        <w:t xml:space="preserve"> and GHG Protocol Scope 2 standards </w:t>
+      </w:r>
+      <w:bookmarkStart w:id="110" w:name="cite_14"/>
+      <w:bookmarkEnd w:id="110"/>
+      <w:hyperlink w:anchor="ref_14" w:history="1">
+        <w:r>
+          <w:rPr>
+            <w:color w:val="1e40af"/>
+            <w:b/>
+            <w:sz w:val="20"/>
+            <w:u w:val="none"/>
+          </w:rPr>
+          <w:t xml:space="preserve">[14]</w:t>
+        </w:r>
+      </w:hyperlink>
+      <w:r>
+        <w:rPr>
+          <w:rFonts w:ascii="Times New Roman" w:hAnsi="Times New Roman"/>
+          <w:sz w:val="20"/>
+        </w:rPr>
+        <w:t xml:space="preserve">, incorporating regional grid emission factors (CEA India 713 gCO2/kWh) </w:t>
+      </w:r>
+      <w:bookmarkStart w:id="111" w:name="cite_13"/>
+      <w:bookmarkEnd w:id="111"/>
+      <w:hyperlink w:anchor="ref_13" w:history="1">
+        <w:r>
+          <w:rPr>
+            <w:color w:val="1e40af"/>
+            <w:b/>
+            <w:sz w:val="20"/>
+            <w:u w:val="none"/>
+          </w:rPr>
+          <w:t xml:space="preserve">[13]</w:t>
+        </w:r>
+      </w:hyperlink>
+      <w:r>
+        <w:rPr>
+          <w:rFonts w:ascii="Times New Roman" w:hAnsi="Times New Roman"/>
+          <w:sz w:val="20"/>
+        </w:rPr>
+        <w:t xml:space="preserve"> with zero-division mathematical safeguards.</w:t>
       </w:r>
     </w:p>
     <w:p>
       <w:pPr>
-        <w:spacing w:before="0" w:after="120"/>
+        <w:spacing w:before="0" w:after="80" w:line="259" w:lineRule="auto"/>
         <w:jc w:val="both"/>
       </w:pPr>
       <w:r>
@@ -335,7 +627,7 @@
     </w:p>
     <w:p>
       <w:pPr>
-        <w:spacing w:before="0" w:after="120"/>
+        <w:spacing w:before="0" w:after="80" w:line="259" w:lineRule="auto"/>
         <w:jc w:val="both"/>
       </w:pPr>
       <w:r>
@@ -343,26 +635,47 @@
           <w:rFonts w:ascii="Times New Roman" w:hAnsi="Times New Roman"/>
           <w:sz w:val="20"/>
         </w:rPr>
-        <w:t>• A four-tier hierarchical Role-Based Access Control (RBAC) security model with Boss Admin root authority, strict delegation ceiling enforcement, and investigator case scoping to eliminate unauthorized operational manipulation.</w:t>
+        <w:t xml:space="preserve">• A four-tier hierarchical Role-Based Access Control (RBAC) security model with Boss Admin root authority, strict delegation ceiling enforcement, and investigator case scoping adhering to OWASP ASVS 5.0.0 </w:t>
+      </w:r>
+      <w:bookmarkStart w:id="112" w:name="cite_15"/>
+      <w:bookmarkEnd w:id="112"/>
+      <w:hyperlink w:anchor="ref_15" w:history="1">
+        <w:r>
+          <w:rPr>
+            <w:color w:val="1e40af"/>
+            <w:b/>
+            <w:sz w:val="20"/>
+            <w:u w:val="none"/>
+          </w:rPr>
+          <w:t xml:space="preserve">[15]</w:t>
+        </w:r>
+      </w:hyperlink>
+      <w:r>
+        <w:rPr>
+          <w:rFonts w:ascii="Times New Roman" w:hAnsi="Times New Roman"/>
+          <w:sz w:val="20"/>
+        </w:rPr>
+        <w:t xml:space="preserve"> to eliminate unauthorized operational manipulation.</w:t>
       </w:r>
     </w:p>
     <w:p>
       <w:pPr>
-        <w:spacing w:before="280" w:after="80"/>
-        <w:jc w:val="left"/>
+        <w:keepNext/>
+        <w:spacing w:before="240" w:after="80"/>
       </w:pPr>
       <w:r>
         <w:rPr>
           <w:rFonts w:ascii="Times New Roman" w:hAnsi="Times New Roman"/>
           <w:b/>
-          <w:sz w:val="22"/>
+          <w:color w:val="0F172A"/>
+          <w:sz w:val="21"/>
         </w:rPr>
         <w:t>II. RELATED WORK &amp; COMPARATIVE ANALYSIS</w:t>
       </w:r>
     </w:p>
     <w:p>
       <w:pPr>
-        <w:spacing w:before="0" w:after="120"/>
+        <w:spacing w:before="0" w:after="80" w:line="259" w:lineRule="auto"/>
         <w:jc w:val="both"/>
       </w:pPr>
       <w:r>
@@ -375,14 +688,15 @@
     </w:p>
     <w:p>
       <w:pPr>
-        <w:spacing w:before="200" w:after="60"/>
-        <w:jc w:val="left"/>
+        <w:keepNext/>
+        <w:spacing w:before="160" w:after="60"/>
       </w:pPr>
       <w:r>
         <w:rPr>
           <w:rFonts w:ascii="Times New Roman" w:hAnsi="Times New Roman"/>
           <w:b/>
           <w:i/>
+          <w:color w:val="1E293B"/>
           <w:sz w:val="20"/>
         </w:rPr>
         <w:t>A. Energy Telemetry and Kernel Probing</w:t>
@@ -390,7 +704,7 @@
     </w:p>
     <w:p>
       <w:pPr>
-        <w:spacing w:before="0" w:after="120"/>
+        <w:spacing w:before="0" w:after="80" w:line="259" w:lineRule="auto"/>
         <w:jc w:val="both"/>
       </w:pPr>
       <w:r>
@@ -398,19 +712,56 @@
           <w:rFonts w:ascii="Times New Roman" w:hAnsi="Times New Roman"/>
           <w:sz w:val="20"/>
         </w:rPr>
-        <w:t>Hardware-level energy telemetry on x86 architectures has matured significantly with Intel's Running Average Power Limit (RAPL) interface, which provides non-architectural MSRs tracking energy consumption across the CPU Package (core + uncore) and DRAM memory planes. CNCF Kepler (Kubernetes-based Efficient Power Level Exporter) [2] utilizes extended Berkeley Packet Filters (eBPF) to attach to kernel tracepoints (such as process scheduling and context switching), measuring CPU cycles and memory residency to train Regression and BPF-based energy attribution models. Similarly, Hubblo Scaphandre [9] probes the Linux powercap sysfs interface (/sys/class/powercap/intel-rapl/) to expose raw Joules consumption. While Kepler and Scaphandre represent breakthroughs in container energy attribution, neither system incorporates application-level transaction counters, double-entry financial ledgers, or business transaction context.</w:t>
+        <w:t xml:space="preserve">Hardware-level energy telemetry on x86 architectures has matured significantly with Intel's Running Average Power Limit (RAPL) interface, which provides non-architectural MSRs tracking energy consumption across the CPU Package (core + uncore) and DRAM memory planes. CNCF Kepler (Kubernetes-based Efficient Power Level Exporter) </w:t>
+      </w:r>
+      <w:hyperlink w:anchor="ref_2" w:history="1">
+        <w:r>
+          <w:rPr>
+            <w:color w:val="1e40af"/>
+            <w:b/>
+            <w:sz w:val="20"/>
+            <w:u w:val="none"/>
+          </w:rPr>
+          <w:t xml:space="preserve">[2]</w:t>
+        </w:r>
+      </w:hyperlink>
+      <w:r>
+        <w:rPr>
+          <w:rFonts w:ascii="Times New Roman" w:hAnsi="Times New Roman"/>
+          <w:sz w:val="20"/>
+        </w:rPr>
+        <w:t xml:space="preserve"> utilizes extended Berkeley Packet Filters (eBPF) to attach to kernel tracepoints (such as process scheduling and context switching), measuring CPU cycles and memory residency to train Regression and BPF-based energy attribution models. Similarly, Hubblo Scaphandre </w:t>
+      </w:r>
+      <w:hyperlink w:anchor="ref_9" w:history="1">
+        <w:r>
+          <w:rPr>
+            <w:color w:val="1e40af"/>
+            <w:b/>
+            <w:sz w:val="20"/>
+            <w:u w:val="none"/>
+          </w:rPr>
+          <w:t xml:space="preserve">[9]</w:t>
+        </w:r>
+      </w:hyperlink>
+      <w:r>
+        <w:rPr>
+          <w:rFonts w:ascii="Times New Roman" w:hAnsi="Times New Roman"/>
+          <w:sz w:val="20"/>
+        </w:rPr>
+        <w:t xml:space="preserve"> probes the Linux powercap sysfs interface (/sys/class/powercap/intel-rapl/) to expose raw Joules consumption. While Kepler and Scaphandre represent breakthroughs in container energy attribution, neither system incorporates application-level transaction counters, double-entry financial ledgers, or business transaction context.</w:t>
       </w:r>
     </w:p>
     <w:p>
       <w:pPr>
-        <w:spacing w:before="200" w:after="60"/>
-        <w:jc w:val="left"/>
+        <w:keepNext/>
+        <w:spacing w:before="160" w:after="60"/>
       </w:pPr>
       <w:r>
         <w:rPr>
           <w:rFonts w:ascii="Times New Roman" w:hAnsi="Times New Roman"/>
           <w:b/>
           <w:i/>
+          <w:color w:val="1E293B"/>
           <w:sz w:val="20"/>
         </w:rPr>
         <w:t>B. Software Carbon Standards and Heuristic Frameworks</w:t>
@@ -418,7 +769,7 @@
     </w:p>
     <w:p>
       <w:pPr>
-        <w:spacing w:before="0" w:after="120"/>
+        <w:spacing w:before="0" w:after="80" w:line="259" w:lineRule="auto"/>
         <w:jc w:val="both"/>
       </w:pPr>
       <w:r>
@@ -426,19 +777,76 @@
           <w:rFonts w:ascii="Times New Roman" w:hAnsi="Times New Roman"/>
           <w:sz w:val="20"/>
         </w:rPr>
-        <w:t>The Green Software Foundation (GSF) developed the Software Carbon Intensity (SCI) specification, formally ratified as ISO/IEC 21031:2024 [10]. The SCI standard defines a rate-based metric: SCI = (O + M) / R, where O represents operational emissions, M represents embodied hardware emissions, and R is the functional unit (e.g., per transaction, per API call). While ISO/IEC 21031 provides the mathematical foundation, it is purely a specification and does not prescribe an executable technical architecture. Cloud Carbon Footprint (CCF) [5] operationalizes cloud-level emissions by parsing cloud billing records and multiplying virtual CPU hours by static coefficient tables. However, CCF point estimates cannot observe transient intra-second workload spikes or provide transaction-level attribution. GreenFrame [11] measures web applications via headless browser scenarios, but relies on synthetic offline runs rather than live, production-grade microservice traffic.</w:t>
+        <w:t xml:space="preserve">The Green Software Foundation (GSF) developed the Software Carbon Intensity (SCI) specification, formally ratified as ISO/IEC 21031:2024 </w:t>
+      </w:r>
+      <w:hyperlink w:anchor="ref_10" w:history="1">
+        <w:r>
+          <w:rPr>
+            <w:color w:val="1e40af"/>
+            <w:b/>
+            <w:sz w:val="20"/>
+            <w:u w:val="none"/>
+          </w:rPr>
+          <w:t xml:space="preserve">[10]</w:t>
+        </w:r>
+      </w:hyperlink>
+      <w:r>
+        <w:rPr>
+          <w:rFonts w:ascii="Times New Roman" w:hAnsi="Times New Roman"/>
+          <w:sz w:val="20"/>
+        </w:rPr>
+        <w:t xml:space="preserve">. The SCI standard defines a rate-based metric: SCI = (O + M) / R, where O represents operational emissions, M represents embodied hardware emissions, and R is the functional unit (e.g., per transaction, per API call). While ISO/IEC 21031 provides the mathematical foundation, it is purely a specification and does not prescribe an executable technical architecture. Cloud Carbon Footprint (CCF) </w:t>
+      </w:r>
+      <w:hyperlink w:anchor="ref_5" w:history="1">
+        <w:r>
+          <w:rPr>
+            <w:color w:val="1e40af"/>
+            <w:b/>
+            <w:sz w:val="20"/>
+            <w:u w:val="none"/>
+          </w:rPr>
+          <w:t xml:space="preserve">[5]</w:t>
+        </w:r>
+      </w:hyperlink>
+      <w:r>
+        <w:rPr>
+          <w:rFonts w:ascii="Times New Roman" w:hAnsi="Times New Roman"/>
+          <w:sz w:val="20"/>
+        </w:rPr>
+        <w:t xml:space="preserve"> operationalizes cloud-level emissions by parsing cloud billing records and multiplying virtual CPU hours by static coefficient tables. However, CCF point estimates cannot observe transient intra-second workload spikes or provide transaction-level attribution. GreenFrame </w:t>
+      </w:r>
+      <w:bookmarkStart w:id="113" w:name="cite_11"/>
+      <w:bookmarkEnd w:id="113"/>
+      <w:hyperlink w:anchor="ref_11" w:history="1">
+        <w:r>
+          <w:rPr>
+            <w:color w:val="1e40af"/>
+            <w:b/>
+            <w:sz w:val="20"/>
+            <w:u w:val="none"/>
+          </w:rPr>
+          <w:t xml:space="preserve">[11]</w:t>
+        </w:r>
+      </w:hyperlink>
+      <w:r>
+        <w:rPr>
+          <w:rFonts w:ascii="Times New Roman" w:hAnsi="Times New Roman"/>
+          <w:sz w:val="20"/>
+        </w:rPr>
+        <w:t xml:space="preserve"> measures web applications via headless browser scenarios, but relies on synthetic offline runs rather than live, production-grade microservice traffic.</w:t>
       </w:r>
     </w:p>
     <w:p>
       <w:pPr>
-        <w:spacing w:before="200" w:after="60"/>
-        <w:jc w:val="left"/>
+        <w:keepNext/>
+        <w:spacing w:before="160" w:after="60"/>
       </w:pPr>
       <w:r>
         <w:rPr>
           <w:rFonts w:ascii="Times New Roman" w:hAnsi="Times New Roman"/>
           <w:b/>
           <w:i/>
+          <w:color w:val="1E293B"/>
           <w:sz w:val="20"/>
         </w:rPr>
         <w:t>C. Financial Emissions Calculators and ESG Reporting</w:t>
@@ -446,7 +854,7 @@
     </w:p>
     <w:p>
       <w:pPr>
-        <w:spacing w:before="0" w:after="120"/>
+        <w:spacing w:before="0" w:after="80" w:line="259" w:lineRule="auto"/>
         <w:jc w:val="both"/>
       </w:pPr>
       <w:r>
@@ -454,12 +862,86 @@
           <w:rFonts w:ascii="Times New Roman" w:hAnsi="Times New Roman"/>
           <w:sz w:val="20"/>
         </w:rPr>
-        <w:t>In the commercial banking sector, institutions such as the Bank of New Zealand (BNZ) [8] and platforms like CarbonTrail [7] have introduced spend-based emissions reporting for small and medium enterprises (SMEs). These platforms classify customer financial expenditures into merchant category codes (MCCs) and apply broad Scope 3 input-output emissions factors. While commercially successful, they assess the external business activity of the bank's customers rather than the internal operational Scope 2 emissions of the software infrastructure executing the banking core. Furthermore, recent empirical studies on artificial intelligence and large-scale workload sustainability by Jeanquartier et al. [1] emphasize the critical absence of standardized, transparent, and reproducible energy reporting in modern distributed computing.</w:t>
+        <w:t xml:space="preserve">In the commercial banking sector, institutions such as the Bank of New Zealand (BNZ) </w:t>
+      </w:r>
+      <w:hyperlink w:anchor="ref_8" w:history="1">
+        <w:r>
+          <w:rPr>
+            <w:color w:val="1e40af"/>
+            <w:b/>
+            <w:sz w:val="20"/>
+            <w:u w:val="none"/>
+          </w:rPr>
+          <w:t xml:space="preserve">[8]</w:t>
+        </w:r>
+      </w:hyperlink>
+      <w:r>
+        <w:rPr>
+          <w:rFonts w:ascii="Times New Roman" w:hAnsi="Times New Roman"/>
+          <w:sz w:val="20"/>
+        </w:rPr>
+        <w:t xml:space="preserve"> and platforms like CarbonTrail </w:t>
+      </w:r>
+      <w:hyperlink w:anchor="ref_7" w:history="1">
+        <w:r>
+          <w:rPr>
+            <w:color w:val="1e40af"/>
+            <w:b/>
+            <w:sz w:val="20"/>
+            <w:u w:val="none"/>
+          </w:rPr>
+          <w:t xml:space="preserve">[7]</w:t>
+        </w:r>
+      </w:hyperlink>
+      <w:r>
+        <w:rPr>
+          <w:rFonts w:ascii="Times New Roman" w:hAnsi="Times New Roman"/>
+          <w:sz w:val="20"/>
+        </w:rPr>
+        <w:t xml:space="preserve"> have introduced spend-based emissions reporting for small and medium enterprises (SMEs). These platforms classify customer financial expenditures into merchant category codes (MCCs) and apply broad Scope 3 input-output emissions factors. While commercially successful, they assess the external business activity of the bank's customers rather than the internal operational Scope 2 emissions of the software infrastructure executing the banking core. Furthermore, recent empirical studies on artificial intelligence and large-scale workload sustainability by Jeanquartier et al. </w:t>
+      </w:r>
+      <w:hyperlink w:anchor="ref_1" w:history="1">
+        <w:r>
+          <w:rPr>
+            <w:color w:val="1e40af"/>
+            <w:b/>
+            <w:sz w:val="20"/>
+            <w:u w:val="none"/>
+          </w:rPr>
+          <w:t xml:space="preserve">[1]</w:t>
+        </w:r>
+      </w:hyperlink>
+      <w:r>
+        <w:rPr>
+          <w:rFonts w:ascii="Times New Roman" w:hAnsi="Times New Roman"/>
+          <w:sz w:val="20"/>
+        </w:rPr>
+        <w:t xml:space="preserve"> and FinOps unit economics by the FinOps Foundation </w:t>
+      </w:r>
+      <w:bookmarkStart w:id="114" w:name="cite_12"/>
+      <w:bookmarkEnd w:id="114"/>
+      <w:hyperlink w:anchor="ref_12" w:history="1">
+        <w:r>
+          <w:rPr>
+            <w:color w:val="1e40af"/>
+            <w:b/>
+            <w:sz w:val="20"/>
+            <w:u w:val="none"/>
+          </w:rPr>
+          <w:t xml:space="preserve">[12]</w:t>
+        </w:r>
+      </w:hyperlink>
+      <w:r>
+        <w:rPr>
+          <w:rFonts w:ascii="Times New Roman" w:hAnsi="Times New Roman"/>
+          <w:sz w:val="20"/>
+        </w:rPr>
+        <w:t xml:space="preserve"> emphasize the critical absence of standardized, transparent, and reproducible energy reporting in modern distributed computing.</w:t>
       </w:r>
     </w:p>
     <w:p>
       <w:pPr>
-        <w:spacing w:before="0" w:after="120"/>
+        <w:spacing w:before="0" w:after="80" w:line="259" w:lineRule="auto"/>
         <w:jc w:val="both"/>
       </w:pPr>
       <w:r>
@@ -491,10 +973,10 @@
             <w:tcW w:type="dxa" w:w="1680"/>
             <w:shd w:val="clear" w:color="auto" w:fill="0f172a"/>
             <w:tcMar>
-              <w:top w:w="80" w:type="dxa"/>
-              <w:bottom w:w="80" w:type="dxa"/>
-              <w:left w:w="100" w:type="dxa"/>
-              <w:right w:w="100" w:type="dxa"/>
+              <w:top w:w="70" w:type="dxa"/>
+              <w:bottom w:w="70" w:type="dxa"/>
+              <w:left w:w="90" w:type="dxa"/>
+              <w:right w:w="90" w:type="dxa"/>
             </w:tcMar>
           </w:tcPr>
           <w:p>
@@ -516,10 +998,10 @@
             <w:tcW w:type="dxa" w:w="1680"/>
             <w:shd w:val="clear" w:color="auto" w:fill="0f172a"/>
             <w:tcMar>
-              <w:top w:w="80" w:type="dxa"/>
-              <w:bottom w:w="80" w:type="dxa"/>
-              <w:left w:w="100" w:type="dxa"/>
-              <w:right w:w="100" w:type="dxa"/>
+              <w:top w:w="70" w:type="dxa"/>
+              <w:bottom w:w="70" w:type="dxa"/>
+              <w:left w:w="90" w:type="dxa"/>
+              <w:right w:w="90" w:type="dxa"/>
             </w:tcMar>
           </w:tcPr>
           <w:p>
@@ -541,10 +1023,10 @@
             <w:tcW w:type="dxa" w:w="1680"/>
             <w:shd w:val="clear" w:color="auto" w:fill="0f172a"/>
             <w:tcMar>
-              <w:top w:w="80" w:type="dxa"/>
-              <w:bottom w:w="80" w:type="dxa"/>
-              <w:left w:w="100" w:type="dxa"/>
-              <w:right w:w="100" w:type="dxa"/>
+              <w:top w:w="70" w:type="dxa"/>
+              <w:bottom w:w="70" w:type="dxa"/>
+              <w:left w:w="90" w:type="dxa"/>
+              <w:right w:w="90" w:type="dxa"/>
             </w:tcMar>
           </w:tcPr>
           <w:p>
@@ -566,10 +1048,10 @@
             <w:tcW w:type="dxa" w:w="1680"/>
             <w:shd w:val="clear" w:color="auto" w:fill="0f172a"/>
             <w:tcMar>
-              <w:top w:w="80" w:type="dxa"/>
-              <w:bottom w:w="80" w:type="dxa"/>
-              <w:left w:w="100" w:type="dxa"/>
-              <w:right w:w="100" w:type="dxa"/>
+              <w:top w:w="70" w:type="dxa"/>
+              <w:bottom w:w="70" w:type="dxa"/>
+              <w:left w:w="90" w:type="dxa"/>
+              <w:right w:w="90" w:type="dxa"/>
             </w:tcMar>
           </w:tcPr>
           <w:p>
@@ -591,10 +1073,10 @@
             <w:tcW w:type="dxa" w:w="1680"/>
             <w:shd w:val="clear" w:color="auto" w:fill="0f172a"/>
             <w:tcMar>
-              <w:top w:w="80" w:type="dxa"/>
-              <w:bottom w:w="80" w:type="dxa"/>
-              <w:left w:w="100" w:type="dxa"/>
-              <w:right w:w="100" w:type="dxa"/>
+              <w:top w:w="70" w:type="dxa"/>
+              <w:bottom w:w="70" w:type="dxa"/>
+              <w:left w:w="90" w:type="dxa"/>
+              <w:right w:w="90" w:type="dxa"/>
             </w:tcMar>
           </w:tcPr>
           <w:p>
@@ -616,10 +1098,10 @@
             <w:tcW w:type="dxa" w:w="1680"/>
             <w:shd w:val="clear" w:color="auto" w:fill="0f172a"/>
             <w:tcMar>
-              <w:top w:w="80" w:type="dxa"/>
-              <w:bottom w:w="80" w:type="dxa"/>
-              <w:left w:w="100" w:type="dxa"/>
-              <w:right w:w="100" w:type="dxa"/>
+              <w:top w:w="70" w:type="dxa"/>
+              <w:bottom w:w="70" w:type="dxa"/>
+              <w:left w:w="90" w:type="dxa"/>
+              <w:right w:w="90" w:type="dxa"/>
             </w:tcMar>
           </w:tcPr>
           <w:p>
@@ -643,10 +1125,10 @@
             <w:tcW w:type="dxa" w:w="1680"/>
             <w:shd w:val="clear" w:color="auto" w:fill="f8fafc"/>
             <w:tcMar>
-              <w:top w:w="60" w:type="dxa"/>
-              <w:bottom w:w="60" w:type="dxa"/>
-              <w:left w:w="80" w:type="dxa"/>
-              <w:right w:w="80" w:type="dxa"/>
+              <w:top w:w="50" w:type="dxa"/>
+              <w:bottom w:w="50" w:type="dxa"/>
+              <w:left w:w="70" w:type="dxa"/>
+              <w:right w:w="70" w:type="dxa"/>
             </w:tcMar>
           </w:tcPr>
           <w:p>
@@ -655,10 +1137,22 @@
             </w:pPr>
             <w:r>
               <w:rPr>
+                <w:b/>
                 <w:sz w:val="15"/>
               </w:rPr>
-              <w:t>Jeanquartier et al. [1]</w:t>
+              <w:t xml:space="preserve">Jeanquartier et al. </w:t>
             </w:r>
+            <w:hyperlink w:anchor="ref_1" w:history="1">
+              <w:r>
+                <w:rPr>
+                  <w:color w:val="1e40af"/>
+                  <w:b/>
+                  <w:sz w:val="15"/>
+                  <w:u w:val="none"/>
+                </w:rPr>
+                <w:t xml:space="preserve">[1]</w:t>
+              </w:r>
+            </w:hyperlink>
           </w:p>
         </w:tc>
         <w:tc>
@@ -666,10 +1160,10 @@
             <w:tcW w:type="dxa" w:w="1680"/>
             <w:shd w:val="clear" w:color="auto" w:fill="f8fafc"/>
             <w:tcMar>
-              <w:top w:w="60" w:type="dxa"/>
-              <w:bottom w:w="60" w:type="dxa"/>
-              <w:left w:w="80" w:type="dxa"/>
-              <w:right w:w="80" w:type="dxa"/>
+              <w:top w:w="50" w:type="dxa"/>
+              <w:bottom w:w="50" w:type="dxa"/>
+              <w:left w:w="70" w:type="dxa"/>
+              <w:right w:w="70" w:type="dxa"/>
             </w:tcMar>
           </w:tcPr>
           <w:p>
@@ -678,7 +1172,7 @@
             </w:pPr>
             <w:r>
               <w:rPr>
-                <w:sz w:val="15"/>
+                <w:sz w:val="14"/>
               </w:rPr>
               <w:t>AI Model Benchmarking</w:t>
             </w:r>
@@ -689,10 +1183,10 @@
             <w:tcW w:type="dxa" w:w="1680"/>
             <w:shd w:val="clear" w:color="auto" w:fill="f8fafc"/>
             <w:tcMar>
-              <w:top w:w="60" w:type="dxa"/>
-              <w:bottom w:w="60" w:type="dxa"/>
-              <w:left w:w="80" w:type="dxa"/>
-              <w:right w:w="80" w:type="dxa"/>
+              <w:top w:w="50" w:type="dxa"/>
+              <w:bottom w:w="50" w:type="dxa"/>
+              <w:left w:w="70" w:type="dxa"/>
+              <w:right w:w="70" w:type="dxa"/>
             </w:tcMar>
           </w:tcPr>
           <w:p>
@@ -701,9 +1195,9 @@
             </w:pPr>
             <w:r>
               <w:rPr>
-                <w:sz w:val="15"/>
+                <w:sz w:val="14"/>
               </w:rPr>
-              <w:t>GPU/RAPL Benchmarks</w:t>
+              <w:t>GPU / RAPL Benchmarks</w:t>
             </w:r>
           </w:p>
         </w:tc>
@@ -712,10 +1206,10 @@
             <w:tcW w:type="dxa" w:w="1680"/>
             <w:shd w:val="clear" w:color="auto" w:fill="f8fafc"/>
             <w:tcMar>
-              <w:top w:w="60" w:type="dxa"/>
-              <w:bottom w:w="60" w:type="dxa"/>
-              <w:left w:w="80" w:type="dxa"/>
-              <w:right w:w="80" w:type="dxa"/>
+              <w:top w:w="50" w:type="dxa"/>
+              <w:bottom w:w="50" w:type="dxa"/>
+              <w:left w:w="70" w:type="dxa"/>
+              <w:right w:w="70" w:type="dxa"/>
             </w:tcMar>
           </w:tcPr>
           <w:p>
@@ -724,7 +1218,7 @@
             </w:pPr>
             <w:r>
               <w:rPr>
-                <w:sz w:val="15"/>
+                <w:sz w:val="14"/>
               </w:rPr>
               <w:t>None (LLM Inference)</w:t>
             </w:r>
@@ -735,10 +1229,10 @@
             <w:tcW w:type="dxa" w:w="1680"/>
             <w:shd w:val="clear" w:color="auto" w:fill="f8fafc"/>
             <w:tcMar>
-              <w:top w:w="60" w:type="dxa"/>
-              <w:bottom w:w="60" w:type="dxa"/>
-              <w:left w:w="80" w:type="dxa"/>
-              <w:right w:w="80" w:type="dxa"/>
+              <w:top w:w="50" w:type="dxa"/>
+              <w:bottom w:w="50" w:type="dxa"/>
+              <w:left w:w="70" w:type="dxa"/>
+              <w:right w:w="70" w:type="dxa"/>
             </w:tcMar>
           </w:tcPr>
           <w:p>
@@ -747,7 +1241,7 @@
             </w:pPr>
             <w:r>
               <w:rPr>
-                <w:sz w:val="15"/>
+                <w:sz w:val="14"/>
               </w:rPr>
               <w:t>Total kg CO2e</w:t>
             </w:r>
@@ -758,10 +1252,10 @@
             <w:tcW w:type="dxa" w:w="1680"/>
             <w:shd w:val="clear" w:color="auto" w:fill="f8fafc"/>
             <w:tcMar>
-              <w:top w:w="60" w:type="dxa"/>
-              <w:bottom w:w="60" w:type="dxa"/>
-              <w:left w:w="80" w:type="dxa"/>
-              <w:right w:w="80" w:type="dxa"/>
+              <w:top w:w="50" w:type="dxa"/>
+              <w:bottom w:w="50" w:type="dxa"/>
+              <w:left w:w="70" w:type="dxa"/>
+              <w:right w:w="70" w:type="dxa"/>
             </w:tcMar>
           </w:tcPr>
           <w:p>
@@ -770,7 +1264,7 @@
             </w:pPr>
             <w:r>
               <w:rPr>
-                <w:sz w:val="15"/>
+                <w:sz w:val="14"/>
               </w:rPr>
               <w:t>None (Static Paper)</w:t>
             </w:r>
@@ -783,10 +1277,10 @@
             <w:tcW w:type="dxa" w:w="1680"/>
             <w:shd w:val="clear" w:color="auto" w:fill="ffffff"/>
             <w:tcMar>
-              <w:top w:w="60" w:type="dxa"/>
-              <w:bottom w:w="60" w:type="dxa"/>
-              <w:left w:w="80" w:type="dxa"/>
-              <w:right w:w="80" w:type="dxa"/>
+              <w:top w:w="50" w:type="dxa"/>
+              <w:bottom w:w="50" w:type="dxa"/>
+              <w:left w:w="70" w:type="dxa"/>
+              <w:right w:w="70" w:type="dxa"/>
             </w:tcMar>
           </w:tcPr>
           <w:p>
@@ -795,10 +1289,22 @@
             </w:pPr>
             <w:r>
               <w:rPr>
+                <w:b/>
                 <w:sz w:val="15"/>
               </w:rPr>
-              <w:t>CNCF Kepler [2]</w:t>
+              <w:t xml:space="preserve">CNCF Kepler </w:t>
             </w:r>
+            <w:hyperlink w:anchor="ref_2" w:history="1">
+              <w:r>
+                <w:rPr>
+                  <w:color w:val="1e40af"/>
+                  <w:b/>
+                  <w:sz w:val="15"/>
+                  <w:u w:val="none"/>
+                </w:rPr>
+                <w:t xml:space="preserve">[2]</w:t>
+              </w:r>
+            </w:hyperlink>
           </w:p>
         </w:tc>
         <w:tc>
@@ -806,10 +1312,10 @@
             <w:tcW w:type="dxa" w:w="1680"/>
             <w:shd w:val="clear" w:color="auto" w:fill="ffffff"/>
             <w:tcMar>
-              <w:top w:w="60" w:type="dxa"/>
-              <w:bottom w:w="60" w:type="dxa"/>
-              <w:left w:w="80" w:type="dxa"/>
-              <w:right w:w="80" w:type="dxa"/>
+              <w:top w:w="50" w:type="dxa"/>
+              <w:bottom w:w="50" w:type="dxa"/>
+              <w:left w:w="70" w:type="dxa"/>
+              <w:right w:w="70" w:type="dxa"/>
             </w:tcMar>
           </w:tcPr>
           <w:p>
@@ -818,7 +1324,7 @@
             </w:pPr>
             <w:r>
               <w:rPr>
-                <w:sz w:val="15"/>
+                <w:sz w:val="14"/>
               </w:rPr>
               <w:t>Kubernetes Energy Telemetry</w:t>
             </w:r>
@@ -829,10 +1335,10 @@
             <w:tcW w:type="dxa" w:w="1680"/>
             <w:shd w:val="clear" w:color="auto" w:fill="ffffff"/>
             <w:tcMar>
-              <w:top w:w="60" w:type="dxa"/>
-              <w:bottom w:w="60" w:type="dxa"/>
-              <w:left w:w="80" w:type="dxa"/>
-              <w:right w:w="80" w:type="dxa"/>
+              <w:top w:w="50" w:type="dxa"/>
+              <w:bottom w:w="50" w:type="dxa"/>
+              <w:left w:w="70" w:type="dxa"/>
+              <w:right w:w="70" w:type="dxa"/>
             </w:tcMar>
           </w:tcPr>
           <w:p>
@@ -841,7 +1347,7 @@
             </w:pPr>
             <w:r>
               <w:rPr>
-                <w:sz w:val="15"/>
+                <w:sz w:val="14"/>
               </w:rPr>
               <w:t>eBPF + Intel RAPL MSRs</w:t>
             </w:r>
@@ -852,10 +1358,10 @@
             <w:tcW w:type="dxa" w:w="1680"/>
             <w:shd w:val="clear" w:color="auto" w:fill="ffffff"/>
             <w:tcMar>
-              <w:top w:w="60" w:type="dxa"/>
-              <w:bottom w:w="60" w:type="dxa"/>
-              <w:left w:w="80" w:type="dxa"/>
-              <w:right w:w="80" w:type="dxa"/>
+              <w:top w:w="50" w:type="dxa"/>
+              <w:bottom w:w="50" w:type="dxa"/>
+              <w:left w:w="70" w:type="dxa"/>
+              <w:right w:w="70" w:type="dxa"/>
             </w:tcMar>
           </w:tcPr>
           <w:p>
@@ -864,7 +1370,7 @@
             </w:pPr>
             <w:r>
               <w:rPr>
-                <w:sz w:val="15"/>
+                <w:sz w:val="14"/>
               </w:rPr>
               <w:t>None (Generic Pods)</w:t>
             </w:r>
@@ -875,10 +1381,10 @@
             <w:tcW w:type="dxa" w:w="1680"/>
             <w:shd w:val="clear" w:color="auto" w:fill="ffffff"/>
             <w:tcMar>
-              <w:top w:w="60" w:type="dxa"/>
-              <w:bottom w:w="60" w:type="dxa"/>
-              <w:left w:w="80" w:type="dxa"/>
-              <w:right w:w="80" w:type="dxa"/>
+              <w:top w:w="50" w:type="dxa"/>
+              <w:bottom w:w="50" w:type="dxa"/>
+              <w:left w:w="70" w:type="dxa"/>
+              <w:right w:w="70" w:type="dxa"/>
             </w:tcMar>
           </w:tcPr>
           <w:p>
@@ -887,7 +1393,7 @@
             </w:pPr>
             <w:r>
               <w:rPr>
-                <w:sz w:val="15"/>
+                <w:sz w:val="14"/>
               </w:rPr>
               <w:t>None (Raw Joules)</w:t>
             </w:r>
@@ -898,10 +1404,10 @@
             <w:tcW w:type="dxa" w:w="1680"/>
             <w:shd w:val="clear" w:color="auto" w:fill="ffffff"/>
             <w:tcMar>
-              <w:top w:w="60" w:type="dxa"/>
-              <w:bottom w:w="60" w:type="dxa"/>
-              <w:left w:w="80" w:type="dxa"/>
-              <w:right w:w="80" w:type="dxa"/>
+              <w:top w:w="50" w:type="dxa"/>
+              <w:bottom w:w="50" w:type="dxa"/>
+              <w:left w:w="70" w:type="dxa"/>
+              <w:right w:w="70" w:type="dxa"/>
             </w:tcMar>
           </w:tcPr>
           <w:p>
@@ -910,7 +1416,7 @@
             </w:pPr>
             <w:r>
               <w:rPr>
-                <w:sz w:val="15"/>
+                <w:sz w:val="14"/>
               </w:rPr>
               <w:t>None (Prometheus TSDB)</w:t>
             </w:r>
@@ -923,10 +1429,10 @@
             <w:tcW w:type="dxa" w:w="1680"/>
             <w:shd w:val="clear" w:color="auto" w:fill="f8fafc"/>
             <w:tcMar>
-              <w:top w:w="60" w:type="dxa"/>
-              <w:bottom w:w="60" w:type="dxa"/>
-              <w:left w:w="80" w:type="dxa"/>
-              <w:right w:w="80" w:type="dxa"/>
+              <w:top w:w="50" w:type="dxa"/>
+              <w:bottom w:w="50" w:type="dxa"/>
+              <w:left w:w="70" w:type="dxa"/>
+              <w:right w:w="70" w:type="dxa"/>
             </w:tcMar>
           </w:tcPr>
           <w:p>
@@ -935,10 +1441,22 @@
             </w:pPr>
             <w:r>
               <w:rPr>
+                <w:b/>
                 <w:sz w:val="15"/>
               </w:rPr>
-              <w:t>Cloud Carbon Footprint [5]</w:t>
+              <w:t xml:space="preserve">Cloud Carbon Footprint </w:t>
             </w:r>
+            <w:hyperlink w:anchor="ref_5" w:history="1">
+              <w:r>
+                <w:rPr>
+                  <w:color w:val="1e40af"/>
+                  <w:b/>
+                  <w:sz w:val="15"/>
+                  <w:u w:val="none"/>
+                </w:rPr>
+                <w:t xml:space="preserve">[5]</w:t>
+              </w:r>
+            </w:hyperlink>
           </w:p>
         </w:tc>
         <w:tc>
@@ -946,10 +1464,10 @@
             <w:tcW w:type="dxa" w:w="1680"/>
             <w:shd w:val="clear" w:color="auto" w:fill="f8fafc"/>
             <w:tcMar>
-              <w:top w:w="60" w:type="dxa"/>
-              <w:bottom w:w="60" w:type="dxa"/>
-              <w:left w:w="80" w:type="dxa"/>
-              <w:right w:w="80" w:type="dxa"/>
+              <w:top w:w="50" w:type="dxa"/>
+              <w:bottom w:w="50" w:type="dxa"/>
+              <w:left w:w="70" w:type="dxa"/>
+              <w:right w:w="70" w:type="dxa"/>
             </w:tcMar>
           </w:tcPr>
           <w:p>
@@ -958,7 +1476,7 @@
             </w:pPr>
             <w:r>
               <w:rPr>
-                <w:sz w:val="15"/>
+                <w:sz w:val="14"/>
               </w:rPr>
               <w:t>Multi-Cloud Cost Accounting</w:t>
             </w:r>
@@ -969,10 +1487,10 @@
             <w:tcW w:type="dxa" w:w="1680"/>
             <w:shd w:val="clear" w:color="auto" w:fill="f8fafc"/>
             <w:tcMar>
-              <w:top w:w="60" w:type="dxa"/>
-              <w:bottom w:w="60" w:type="dxa"/>
-              <w:left w:w="80" w:type="dxa"/>
-              <w:right w:w="80" w:type="dxa"/>
+              <w:top w:w="50" w:type="dxa"/>
+              <w:bottom w:w="50" w:type="dxa"/>
+              <w:left w:w="70" w:type="dxa"/>
+              <w:right w:w="70" w:type="dxa"/>
             </w:tcMar>
           </w:tcPr>
           <w:p>
@@ -981,7 +1499,7 @@
             </w:pPr>
             <w:r>
               <w:rPr>
-                <w:sz w:val="15"/>
+                <w:sz w:val="14"/>
               </w:rPr>
               <w:t>Billing Data Heuristics</w:t>
             </w:r>
@@ -992,10 +1510,10 @@
             <w:tcW w:type="dxa" w:w="1680"/>
             <w:shd w:val="clear" w:color="auto" w:fill="f8fafc"/>
             <w:tcMar>
-              <w:top w:w="60" w:type="dxa"/>
-              <w:bottom w:w="60" w:type="dxa"/>
-              <w:left w:w="80" w:type="dxa"/>
-              <w:right w:w="80" w:type="dxa"/>
+              <w:top w:w="50" w:type="dxa"/>
+              <w:bottom w:w="50" w:type="dxa"/>
+              <w:left w:w="70" w:type="dxa"/>
+              <w:right w:w="70" w:type="dxa"/>
             </w:tcMar>
           </w:tcPr>
           <w:p>
@@ -1004,7 +1522,7 @@
             </w:pPr>
             <w:r>
               <w:rPr>
-                <w:sz w:val="15"/>
+                <w:sz w:val="14"/>
               </w:rPr>
               <w:t>None (Cloud Usage)</w:t>
             </w:r>
@@ -1015,10 +1533,10 @@
             <w:tcW w:type="dxa" w:w="1680"/>
             <w:shd w:val="clear" w:color="auto" w:fill="f8fafc"/>
             <w:tcMar>
-              <w:top w:w="60" w:type="dxa"/>
-              <w:bottom w:w="60" w:type="dxa"/>
-              <w:left w:w="80" w:type="dxa"/>
-              <w:right w:w="80" w:type="dxa"/>
+              <w:top w:w="50" w:type="dxa"/>
+              <w:bottom w:w="50" w:type="dxa"/>
+              <w:left w:w="70" w:type="dxa"/>
+              <w:right w:w="70" w:type="dxa"/>
             </w:tcMar>
           </w:tcPr>
           <w:p>
@@ -1027,7 +1545,7 @@
             </w:pPr>
             <w:r>
               <w:rPr>
-                <w:sz w:val="15"/>
+                <w:sz w:val="14"/>
               </w:rPr>
               <w:t>Estimated MT CO2e</w:t>
             </w:r>
@@ -1038,10 +1556,10 @@
             <w:tcW w:type="dxa" w:w="1680"/>
             <w:shd w:val="clear" w:color="auto" w:fill="f8fafc"/>
             <w:tcMar>
-              <w:top w:w="60" w:type="dxa"/>
-              <w:bottom w:w="60" w:type="dxa"/>
-              <w:left w:w="80" w:type="dxa"/>
-              <w:right w:w="80" w:type="dxa"/>
+              <w:top w:w="50" w:type="dxa"/>
+              <w:bottom w:w="50" w:type="dxa"/>
+              <w:left w:w="70" w:type="dxa"/>
+              <w:right w:w="70" w:type="dxa"/>
             </w:tcMar>
           </w:tcPr>
           <w:p>
@@ -1050,7 +1568,7 @@
             </w:pPr>
             <w:r>
               <w:rPr>
-                <w:sz w:val="15"/>
+                <w:sz w:val="14"/>
               </w:rPr>
               <w:t>None (Cloud CSV)</w:t>
             </w:r>
@@ -1063,10 +1581,10 @@
             <w:tcW w:type="dxa" w:w="1680"/>
             <w:shd w:val="clear" w:color="auto" w:fill="ffffff"/>
             <w:tcMar>
-              <w:top w:w="60" w:type="dxa"/>
-              <w:bottom w:w="60" w:type="dxa"/>
-              <w:left w:w="80" w:type="dxa"/>
-              <w:right w:w="80" w:type="dxa"/>
+              <w:top w:w="50" w:type="dxa"/>
+              <w:bottom w:w="50" w:type="dxa"/>
+              <w:left w:w="70" w:type="dxa"/>
+              <w:right w:w="70" w:type="dxa"/>
             </w:tcMar>
           </w:tcPr>
           <w:p>
@@ -1075,9 +1593,44 @@
             </w:pPr>
             <w:r>
               <w:rPr>
+                <w:b/>
                 <w:sz w:val="15"/>
               </w:rPr>
-              <w:t>CarbonTrail / BNZ [7], [8]</w:t>
+              <w:t xml:space="preserve">CarbonTrail / CarbonAPI </w:t>
+            </w:r>
+            <w:hyperlink w:anchor="ref_7" w:history="1">
+              <w:r>
+                <w:rPr>
+                  <w:color w:val="1e40af"/>
+                  <w:b/>
+                  <w:sz w:val="15"/>
+                  <w:u w:val="none"/>
+                </w:rPr>
+                <w:t xml:space="preserve">[7]</w:t>
+              </w:r>
+            </w:hyperlink>
+          </w:p>
+        </w:tc>
+        <w:tc>
+          <w:tcPr>
+            <w:tcW w:type="dxa" w:w="1680"/>
+            <w:shd w:val="clear" w:color="auto" w:fill="ffffff"/>
+            <w:tcMar>
+              <w:top w:w="50" w:type="dxa"/>
+              <w:bottom w:w="50" w:type="dxa"/>
+              <w:left w:w="70" w:type="dxa"/>
+              <w:right w:w="70" w:type="dxa"/>
+            </w:tcMar>
+          </w:tcPr>
+          <w:p>
+            <w:pPr>
+              <w:jc w:val="center"/>
+            </w:pPr>
+            <w:r>
+              <w:rPr>
+                <w:sz w:val="14"/>
+              </w:rPr>
+              <w:t>SME Invoice &amp; Tx Analytics</w:t>
             </w:r>
           </w:p>
         </w:tc>
@@ -1086,10 +1639,10 @@
             <w:tcW w:type="dxa" w:w="1680"/>
             <w:shd w:val="clear" w:color="auto" w:fill="ffffff"/>
             <w:tcMar>
-              <w:top w:w="60" w:type="dxa"/>
-              <w:bottom w:w="60" w:type="dxa"/>
-              <w:left w:w="80" w:type="dxa"/>
-              <w:right w:w="80" w:type="dxa"/>
+              <w:top w:w="50" w:type="dxa"/>
+              <w:bottom w:w="50" w:type="dxa"/>
+              <w:left w:w="70" w:type="dxa"/>
+              <w:right w:w="70" w:type="dxa"/>
             </w:tcMar>
           </w:tcPr>
           <w:p>
@@ -1098,30 +1651,7 @@
             </w:pPr>
             <w:r>
               <w:rPr>
-                <w:sz w:val="15"/>
-              </w:rPr>
-              <w:t>SME Spend Accounting</w:t>
-            </w:r>
-          </w:p>
-        </w:tc>
-        <w:tc>
-          <w:tcPr>
-            <w:tcW w:type="dxa" w:w="1680"/>
-            <w:shd w:val="clear" w:color="auto" w:fill="ffffff"/>
-            <w:tcMar>
-              <w:top w:w="60" w:type="dxa"/>
-              <w:bottom w:w="60" w:type="dxa"/>
-              <w:left w:w="80" w:type="dxa"/>
-              <w:right w:w="80" w:type="dxa"/>
-            </w:tcMar>
-          </w:tcPr>
-          <w:p>
-            <w:pPr>
-              <w:jc w:val="center"/>
-            </w:pPr>
-            <w:r>
-              <w:rPr>
-                <w:sz w:val="15"/>
+                <w:sz w:val="14"/>
               </w:rPr>
               <w:t>None (Spend-based MCC)</w:t>
             </w:r>
@@ -1132,10 +1662,10 @@
             <w:tcW w:type="dxa" w:w="1680"/>
             <w:shd w:val="clear" w:color="auto" w:fill="ffffff"/>
             <w:tcMar>
-              <w:top w:w="60" w:type="dxa"/>
-              <w:bottom w:w="60" w:type="dxa"/>
-              <w:left w:w="80" w:type="dxa"/>
-              <w:right w:w="80" w:type="dxa"/>
+              <w:top w:w="50" w:type="dxa"/>
+              <w:bottom w:w="50" w:type="dxa"/>
+              <w:left w:w="70" w:type="dxa"/>
+              <w:right w:w="70" w:type="dxa"/>
             </w:tcMar>
           </w:tcPr>
           <w:p>
@@ -1144,9 +1674,9 @@
             </w:pPr>
             <w:r>
               <w:rPr>
-                <w:sz w:val="15"/>
+                <w:sz w:val="14"/>
               </w:rPr>
-              <w:t>Business Transactions</w:t>
+              <w:t>Business Invoices</w:t>
             </w:r>
           </w:p>
         </w:tc>
@@ -1155,10 +1685,10 @@
             <w:tcW w:type="dxa" w:w="1680"/>
             <w:shd w:val="clear" w:color="auto" w:fill="ffffff"/>
             <w:tcMar>
-              <w:top w:w="60" w:type="dxa"/>
-              <w:bottom w:w="60" w:type="dxa"/>
-              <w:left w:w="80" w:type="dxa"/>
-              <w:right w:w="80" w:type="dxa"/>
+              <w:top w:w="50" w:type="dxa"/>
+              <w:bottom w:w="50" w:type="dxa"/>
+              <w:left w:w="70" w:type="dxa"/>
+              <w:right w:w="70" w:type="dxa"/>
             </w:tcMar>
           </w:tcPr>
           <w:p>
@@ -1167,7 +1697,7 @@
             </w:pPr>
             <w:r>
               <w:rPr>
-                <w:sz w:val="15"/>
+                <w:sz w:val="14"/>
               </w:rPr>
               <w:t>Spend Proxy Scope 3</w:t>
             </w:r>
@@ -1178,10 +1708,10 @@
             <w:tcW w:type="dxa" w:w="1680"/>
             <w:shd w:val="clear" w:color="auto" w:fill="ffffff"/>
             <w:tcMar>
-              <w:top w:w="60" w:type="dxa"/>
-              <w:bottom w:w="60" w:type="dxa"/>
-              <w:left w:w="80" w:type="dxa"/>
-              <w:right w:w="80" w:type="dxa"/>
+              <w:top w:w="50" w:type="dxa"/>
+              <w:bottom w:w="50" w:type="dxa"/>
+              <w:left w:w="70" w:type="dxa"/>
+              <w:right w:w="70" w:type="dxa"/>
             </w:tcMar>
           </w:tcPr>
           <w:p>
@@ -1190,7 +1720,7 @@
             </w:pPr>
             <w:r>
               <w:rPr>
-                <w:sz w:val="15"/>
+                <w:sz w:val="14"/>
               </w:rPr>
               <w:t>Database Records</w:t>
             </w:r>
@@ -1203,10 +1733,10 @@
             <w:tcW w:type="dxa" w:w="1680"/>
             <w:shd w:val="clear" w:color="auto" w:fill="f8fafc"/>
             <w:tcMar>
-              <w:top w:w="60" w:type="dxa"/>
-              <w:bottom w:w="60" w:type="dxa"/>
-              <w:left w:w="80" w:type="dxa"/>
-              <w:right w:w="80" w:type="dxa"/>
+              <w:top w:w="50" w:type="dxa"/>
+              <w:bottom w:w="50" w:type="dxa"/>
+              <w:left w:w="70" w:type="dxa"/>
+              <w:right w:w="70" w:type="dxa"/>
             </w:tcMar>
           </w:tcPr>
           <w:p>
@@ -1215,9 +1745,44 @@
             </w:pPr>
             <w:r>
               <w:rPr>
+                <w:b/>
                 <w:sz w:val="15"/>
               </w:rPr>
-              <w:t>Hubblo Scaphandre [9]</w:t>
+              <w:t xml:space="preserve">Bank of New Zealand (BNZ) </w:t>
+            </w:r>
+            <w:hyperlink w:anchor="ref_8" w:history="1">
+              <w:r>
+                <w:rPr>
+                  <w:color w:val="1e40af"/>
+                  <w:b/>
+                  <w:sz w:val="15"/>
+                  <w:u w:val="none"/>
+                </w:rPr>
+                <w:t xml:space="preserve">[8]</w:t>
+              </w:r>
+            </w:hyperlink>
+          </w:p>
+        </w:tc>
+        <w:tc>
+          <w:tcPr>
+            <w:tcW w:type="dxa" w:w="1680"/>
+            <w:shd w:val="clear" w:color="auto" w:fill="f8fafc"/>
+            <w:tcMar>
+              <w:top w:w="50" w:type="dxa"/>
+              <w:bottom w:w="50" w:type="dxa"/>
+              <w:left w:w="70" w:type="dxa"/>
+              <w:right w:w="70" w:type="dxa"/>
+            </w:tcMar>
+          </w:tcPr>
+          <w:p>
+            <w:pPr>
+              <w:jc w:val="center"/>
+            </w:pPr>
+            <w:r>
+              <w:rPr>
+                <w:sz w:val="14"/>
+              </w:rPr>
+              <w:t>SME Customer Spend Tool</w:t>
             </w:r>
           </w:p>
         </w:tc>
@@ -1226,10 +1791,10 @@
             <w:tcW w:type="dxa" w:w="1680"/>
             <w:shd w:val="clear" w:color="auto" w:fill="f8fafc"/>
             <w:tcMar>
-              <w:top w:w="60" w:type="dxa"/>
-              <w:bottom w:w="60" w:type="dxa"/>
-              <w:left w:w="80" w:type="dxa"/>
-              <w:right w:w="80" w:type="dxa"/>
+              <w:top w:w="50" w:type="dxa"/>
+              <w:bottom w:w="50" w:type="dxa"/>
+              <w:left w:w="70" w:type="dxa"/>
+              <w:right w:w="70" w:type="dxa"/>
             </w:tcMar>
           </w:tcPr>
           <w:p>
@@ -1238,9 +1803,9 @@
             </w:pPr>
             <w:r>
               <w:rPr>
-                <w:sz w:val="15"/>
+                <w:sz w:val="14"/>
               </w:rPr>
-              <w:t>Linux Energy Monitoring</w:t>
+              <w:t>None (Spend Heuristics)</w:t>
             </w:r>
           </w:p>
         </w:tc>
@@ -1249,10 +1814,10 @@
             <w:tcW w:type="dxa" w:w="1680"/>
             <w:shd w:val="clear" w:color="auto" w:fill="f8fafc"/>
             <w:tcMar>
-              <w:top w:w="60" w:type="dxa"/>
-              <w:bottom w:w="60" w:type="dxa"/>
-              <w:left w:w="80" w:type="dxa"/>
-              <w:right w:w="80" w:type="dxa"/>
+              <w:top w:w="50" w:type="dxa"/>
+              <w:bottom w:w="50" w:type="dxa"/>
+              <w:left w:w="70" w:type="dxa"/>
+              <w:right w:w="70" w:type="dxa"/>
             </w:tcMar>
           </w:tcPr>
           <w:p>
@@ -1261,7 +1826,136 @@
             </w:pPr>
             <w:r>
               <w:rPr>
+                <w:sz w:val="14"/>
+              </w:rPr>
+              <w:t>Business Transactions</w:t>
+            </w:r>
+          </w:p>
+        </w:tc>
+        <w:tc>
+          <w:tcPr>
+            <w:tcW w:type="dxa" w:w="1680"/>
+            <w:shd w:val="clear" w:color="auto" w:fill="f8fafc"/>
+            <w:tcMar>
+              <w:top w:w="50" w:type="dxa"/>
+              <w:bottom w:w="50" w:type="dxa"/>
+              <w:left w:w="70" w:type="dxa"/>
+              <w:right w:w="70" w:type="dxa"/>
+            </w:tcMar>
+          </w:tcPr>
+          <w:p>
+            <w:pPr>
+              <w:jc w:val="center"/>
+            </w:pPr>
+            <w:r>
+              <w:rPr>
+                <w:sz w:val="14"/>
+              </w:rPr>
+              <w:t>Spend Proxy Scope 3</w:t>
+            </w:r>
+          </w:p>
+        </w:tc>
+        <w:tc>
+          <w:tcPr>
+            <w:tcW w:type="dxa" w:w="1680"/>
+            <w:shd w:val="clear" w:color="auto" w:fill="f8fafc"/>
+            <w:tcMar>
+              <w:top w:w="50" w:type="dxa"/>
+              <w:bottom w:w="50" w:type="dxa"/>
+              <w:left w:w="70" w:type="dxa"/>
+              <w:right w:w="70" w:type="dxa"/>
+            </w:tcMar>
+          </w:tcPr>
+          <w:p>
+            <w:pPr>
+              <w:jc w:val="center"/>
+            </w:pPr>
+            <w:r>
+              <w:rPr>
+                <w:sz w:val="14"/>
+              </w:rPr>
+              <w:t>Self-Service Portal</w:t>
+            </w:r>
+          </w:p>
+        </w:tc>
+      </w:tr>
+      <w:tr>
+        <w:tc>
+          <w:tcPr>
+            <w:tcW w:type="dxa" w:w="1680"/>
+            <w:shd w:val="clear" w:color="auto" w:fill="ffffff"/>
+            <w:tcMar>
+              <w:top w:w="50" w:type="dxa"/>
+              <w:bottom w:w="50" w:type="dxa"/>
+              <w:left w:w="70" w:type="dxa"/>
+              <w:right w:w="70" w:type="dxa"/>
+            </w:tcMar>
+          </w:tcPr>
+          <w:p>
+            <w:pPr>
+              <w:jc w:val="left"/>
+            </w:pPr>
+            <w:r>
+              <w:rPr>
+                <w:b/>
                 <w:sz w:val="15"/>
+              </w:rPr>
+              <w:t xml:space="preserve">Hubblo Scaphandre </w:t>
+            </w:r>
+            <w:hyperlink w:anchor="ref_9" w:history="1">
+              <w:r>
+                <w:rPr>
+                  <w:color w:val="1e40af"/>
+                  <w:b/>
+                  <w:sz w:val="15"/>
+                  <w:u w:val="none"/>
+                </w:rPr>
+                <w:t xml:space="preserve">[9]</w:t>
+              </w:r>
+            </w:hyperlink>
+          </w:p>
+        </w:tc>
+        <w:tc>
+          <w:tcPr>
+            <w:tcW w:type="dxa" w:w="1680"/>
+            <w:shd w:val="clear" w:color="auto" w:fill="ffffff"/>
+            <w:tcMar>
+              <w:top w:w="50" w:type="dxa"/>
+              <w:bottom w:w="50" w:type="dxa"/>
+              <w:left w:w="70" w:type="dxa"/>
+              <w:right w:w="70" w:type="dxa"/>
+            </w:tcMar>
+          </w:tcPr>
+          <w:p>
+            <w:pPr>
+              <w:jc w:val="center"/>
+            </w:pPr>
+            <w:r>
+              <w:rPr>
+                <w:sz w:val="14"/>
+              </w:rPr>
+              <w:t>Linux Energy Metrology</w:t>
+            </w:r>
+          </w:p>
+        </w:tc>
+        <w:tc>
+          <w:tcPr>
+            <w:tcW w:type="dxa" w:w="1680"/>
+            <w:shd w:val="clear" w:color="auto" w:fill="ffffff"/>
+            <w:tcMar>
+              <w:top w:w="50" w:type="dxa"/>
+              <w:bottom w:w="50" w:type="dxa"/>
+              <w:left w:w="70" w:type="dxa"/>
+              <w:right w:w="70" w:type="dxa"/>
+            </w:tcMar>
+          </w:tcPr>
+          <w:p>
+            <w:pPr>
+              <w:jc w:val="center"/>
+            </w:pPr>
+            <w:r>
+              <w:rPr>
+                <w:sz w:val="14"/>
               </w:rPr>
               <w:t>Linux Powercap Sysfs</w:t>
             </w:r>
@@ -1270,12 +1964,12 @@
         <w:tc>
           <w:tcPr>
             <w:tcW w:type="dxa" w:w="1680"/>
-            <w:shd w:val="clear" w:color="auto" w:fill="f8fafc"/>
+            <w:shd w:val="clear" w:color="auto" w:fill="ffffff"/>
             <w:tcMar>
-              <w:top w:w="60" w:type="dxa"/>
-              <w:bottom w:w="60" w:type="dxa"/>
-              <w:left w:w="80" w:type="dxa"/>
-              <w:right w:w="80" w:type="dxa"/>
+              <w:top w:w="50" w:type="dxa"/>
+              <w:bottom w:w="50" w:type="dxa"/>
+              <w:left w:w="70" w:type="dxa"/>
+              <w:right w:w="70" w:type="dxa"/>
             </w:tcMar>
           </w:tcPr>
           <w:p>
@@ -1284,7 +1978,7 @@
             </w:pPr>
             <w:r>
               <w:rPr>
-                <w:sz w:val="15"/>
+                <w:sz w:val="14"/>
               </w:rPr>
               <w:t>None (Process PIDs)</w:t>
             </w:r>
@@ -1293,12 +1987,12 @@
         <w:tc>
           <w:tcPr>
             <w:tcW w:type="dxa" w:w="1680"/>
-            <w:shd w:val="clear" w:color="auto" w:fill="f8fafc"/>
+            <w:shd w:val="clear" w:color="auto" w:fill="ffffff"/>
             <w:tcMar>
-              <w:top w:w="60" w:type="dxa"/>
-              <w:bottom w:w="60" w:type="dxa"/>
-              <w:left w:w="80" w:type="dxa"/>
-              <w:right w:w="80" w:type="dxa"/>
+              <w:top w:w="50" w:type="dxa"/>
+              <w:bottom w:w="50" w:type="dxa"/>
+              <w:left w:w="70" w:type="dxa"/>
+              <w:right w:w="70" w:type="dxa"/>
             </w:tcMar>
           </w:tcPr>
           <w:p>
@@ -1307,7 +2001,7 @@
             </w:pPr>
             <w:r>
               <w:rPr>
-                <w:sz w:val="15"/>
+                <w:sz w:val="14"/>
               </w:rPr>
               <w:t>None (Raw Joules)</w:t>
             </w:r>
@@ -1316,12 +2010,12 @@
         <w:tc>
           <w:tcPr>
             <w:tcW w:type="dxa" w:w="1680"/>
-            <w:shd w:val="clear" w:color="auto" w:fill="f8fafc"/>
+            <w:shd w:val="clear" w:color="auto" w:fill="ffffff"/>
             <w:tcMar>
-              <w:top w:w="60" w:type="dxa"/>
-              <w:bottom w:w="60" w:type="dxa"/>
-              <w:left w:w="80" w:type="dxa"/>
-              <w:right w:w="80" w:type="dxa"/>
+              <w:top w:w="50" w:type="dxa"/>
+              <w:bottom w:w="50" w:type="dxa"/>
+              <w:left w:w="70" w:type="dxa"/>
+              <w:right w:w="70" w:type="dxa"/>
             </w:tcMar>
           </w:tcPr>
           <w:p>
@@ -1330,7 +2024,7 @@
             </w:pPr>
             <w:r>
               <w:rPr>
-                <w:sz w:val="15"/>
+                <w:sz w:val="14"/>
               </w:rPr>
               <w:t>None (Prometheus TSDB)</w:t>
             </w:r>
@@ -1341,12 +2035,12 @@
         <w:tc>
           <w:tcPr>
             <w:tcW w:type="dxa" w:w="1680"/>
-            <w:shd w:val="clear" w:color="auto" w:fill="ffffff"/>
+            <w:shd w:val="clear" w:color="auto" w:fill="f8fafc"/>
             <w:tcMar>
-              <w:top w:w="60" w:type="dxa"/>
-              <w:bottom w:w="60" w:type="dxa"/>
-              <w:left w:w="80" w:type="dxa"/>
-              <w:right w:w="80" w:type="dxa"/>
+              <w:top w:w="50" w:type="dxa"/>
+              <w:bottom w:w="50" w:type="dxa"/>
+              <w:left w:w="70" w:type="dxa"/>
+              <w:right w:w="70" w:type="dxa"/>
             </w:tcMar>
           </w:tcPr>
           <w:p>
@@ -1355,21 +2049,33 @@
             </w:pPr>
             <w:r>
               <w:rPr>
+                <w:b/>
                 <w:sz w:val="15"/>
               </w:rPr>
-              <w:t>ISO/IEC 21031 (SCI) [10]</w:t>
+              <w:t xml:space="preserve">ISO/IEC 21031 (SCI) </w:t>
             </w:r>
+            <w:hyperlink w:anchor="ref_10" w:history="1">
+              <w:r>
+                <w:rPr>
+                  <w:color w:val="1e40af"/>
+                  <w:b/>
+                  <w:sz w:val="15"/>
+                  <w:u w:val="none"/>
+                </w:rPr>
+                <w:t xml:space="preserve">[10]</w:t>
+              </w:r>
+            </w:hyperlink>
           </w:p>
         </w:tc>
         <w:tc>
           <w:tcPr>
             <w:tcW w:type="dxa" w:w="1680"/>
-            <w:shd w:val="clear" w:color="auto" w:fill="ffffff"/>
+            <w:shd w:val="clear" w:color="auto" w:fill="f8fafc"/>
             <w:tcMar>
-              <w:top w:w="60" w:type="dxa"/>
-              <w:bottom w:w="60" w:type="dxa"/>
-              <w:left w:w="80" w:type="dxa"/>
-              <w:right w:w="80" w:type="dxa"/>
+              <w:top w:w="50" w:type="dxa"/>
+              <w:bottom w:w="50" w:type="dxa"/>
+              <w:left w:w="70" w:type="dxa"/>
+              <w:right w:w="70" w:type="dxa"/>
             </w:tcMar>
           </w:tcPr>
           <w:p>
@@ -1378,7 +2084,7 @@
             </w:pPr>
             <w:r>
               <w:rPr>
-                <w:sz w:val="15"/>
+                <w:sz w:val="14"/>
               </w:rPr>
               <w:t>International Standard</w:t>
             </w:r>
@@ -1387,12 +2093,12 @@
         <w:tc>
           <w:tcPr>
             <w:tcW w:type="dxa" w:w="1680"/>
-            <w:shd w:val="clear" w:color="auto" w:fill="ffffff"/>
+            <w:shd w:val="clear" w:color="auto" w:fill="f8fafc"/>
             <w:tcMar>
-              <w:top w:w="60" w:type="dxa"/>
-              <w:bottom w:w="60" w:type="dxa"/>
-              <w:left w:w="80" w:type="dxa"/>
-              <w:right w:w="80" w:type="dxa"/>
+              <w:top w:w="50" w:type="dxa"/>
+              <w:bottom w:w="50" w:type="dxa"/>
+              <w:left w:w="70" w:type="dxa"/>
+              <w:right w:w="70" w:type="dxa"/>
             </w:tcMar>
           </w:tcPr>
           <w:p>
@@ -1401,7 +2107,7 @@
             </w:pPr>
             <w:r>
               <w:rPr>
-                <w:sz w:val="15"/>
+                <w:sz w:val="14"/>
               </w:rPr>
               <w:t>Conceptual Specification</w:t>
             </w:r>
@@ -1410,12 +2116,12 @@
         <w:tc>
           <w:tcPr>
             <w:tcW w:type="dxa" w:w="1680"/>
-            <w:shd w:val="clear" w:color="auto" w:fill="ffffff"/>
+            <w:shd w:val="clear" w:color="auto" w:fill="f8fafc"/>
             <w:tcMar>
-              <w:top w:w="60" w:type="dxa"/>
-              <w:bottom w:w="60" w:type="dxa"/>
-              <w:left w:w="80" w:type="dxa"/>
-              <w:right w:w="80" w:type="dxa"/>
+              <w:top w:w="50" w:type="dxa"/>
+              <w:bottom w:w="50" w:type="dxa"/>
+              <w:left w:w="70" w:type="dxa"/>
+              <w:right w:w="70" w:type="dxa"/>
             </w:tcMar>
           </w:tcPr>
           <w:p>
@@ -1424,7 +2130,7 @@
             </w:pPr>
             <w:r>
               <w:rPr>
-                <w:sz w:val="15"/>
+                <w:sz w:val="14"/>
               </w:rPr>
               <w:t>Theoretical Functional Unit</w:t>
             </w:r>
@@ -1433,12 +2139,12 @@
         <w:tc>
           <w:tcPr>
             <w:tcW w:type="dxa" w:w="1680"/>
-            <w:shd w:val="clear" w:color="auto" w:fill="ffffff"/>
+            <w:shd w:val="clear" w:color="auto" w:fill="f8fafc"/>
             <w:tcMar>
-              <w:top w:w="60" w:type="dxa"/>
-              <w:bottom w:w="60" w:type="dxa"/>
-              <w:left w:w="80" w:type="dxa"/>
-              <w:right w:w="80" w:type="dxa"/>
+              <w:top w:w="50" w:type="dxa"/>
+              <w:bottom w:w="50" w:type="dxa"/>
+              <w:left w:w="70" w:type="dxa"/>
+              <w:right w:w="70" w:type="dxa"/>
             </w:tcMar>
           </w:tcPr>
           <w:p>
@@ -1447,7 +2153,7 @@
             </w:pPr>
             <w:r>
               <w:rPr>
-                <w:sz w:val="15"/>
+                <w:sz w:val="14"/>
               </w:rPr>
               <w:t>Rate: (O+M)/R</w:t>
             </w:r>
@@ -1456,12 +2162,12 @@
         <w:tc>
           <w:tcPr>
             <w:tcW w:type="dxa" w:w="1680"/>
-            <w:shd w:val="clear" w:color="auto" w:fill="ffffff"/>
+            <w:shd w:val="clear" w:color="auto" w:fill="f8fafc"/>
             <w:tcMar>
-              <w:top w:w="60" w:type="dxa"/>
-              <w:bottom w:w="60" w:type="dxa"/>
-              <w:left w:w="80" w:type="dxa"/>
-              <w:right w:w="80" w:type="dxa"/>
+              <w:top w:w="50" w:type="dxa"/>
+              <w:bottom w:w="50" w:type="dxa"/>
+              <w:left w:w="70" w:type="dxa"/>
+              <w:right w:w="70" w:type="dxa"/>
             </w:tcMar>
           </w:tcPr>
           <w:p>
@@ -1470,7 +2176,7 @@
             </w:pPr>
             <w:r>
               <w:rPr>
-                <w:sz w:val="15"/>
+                <w:sz w:val="14"/>
               </w:rPr>
               <w:t>Methodological Spec</w:t>
             </w:r>
@@ -1481,12 +2187,316 @@
         <w:tc>
           <w:tcPr>
             <w:tcW w:type="dxa" w:w="1680"/>
+            <w:shd w:val="clear" w:color="auto" w:fill="ffffff"/>
+            <w:tcMar>
+              <w:top w:w="50" w:type="dxa"/>
+              <w:bottom w:w="50" w:type="dxa"/>
+              <w:left w:w="70" w:type="dxa"/>
+              <w:right w:w="70" w:type="dxa"/>
+            </w:tcMar>
+          </w:tcPr>
+          <w:p>
+            <w:pPr>
+              <w:jc w:val="left"/>
+            </w:pPr>
+            <w:r>
+              <w:rPr>
+                <w:b/>
+                <w:sz w:val="15"/>
+              </w:rPr>
+              <w:t xml:space="preserve">GreenFrame </w:t>
+            </w:r>
+            <w:hyperlink w:anchor="ref_11" w:history="1">
+              <w:r>
+                <w:rPr>
+                  <w:color w:val="1e40af"/>
+                  <w:b/>
+                  <w:sz w:val="15"/>
+                  <w:u w:val="none"/>
+                </w:rPr>
+                <w:t xml:space="preserve">[11]</w:t>
+              </w:r>
+            </w:hyperlink>
+          </w:p>
+        </w:tc>
+        <w:tc>
+          <w:tcPr>
+            <w:tcW w:type="dxa" w:w="1680"/>
+            <w:shd w:val="clear" w:color="auto" w:fill="ffffff"/>
+            <w:tcMar>
+              <w:top w:w="50" w:type="dxa"/>
+              <w:bottom w:w="50" w:type="dxa"/>
+              <w:left w:w="70" w:type="dxa"/>
+              <w:right w:w="70" w:type="dxa"/>
+            </w:tcMar>
+          </w:tcPr>
+          <w:p>
+            <w:pPr>
+              <w:jc w:val="center"/>
+            </w:pPr>
+            <w:r>
+              <w:rPr>
+                <w:sz w:val="14"/>
+              </w:rPr>
+              <w:t>Web App Scenario Testing</w:t>
+            </w:r>
+          </w:p>
+        </w:tc>
+        <w:tc>
+          <w:tcPr>
+            <w:tcW w:type="dxa" w:w="1680"/>
+            <w:shd w:val="clear" w:color="auto" w:fill="ffffff"/>
+            <w:tcMar>
+              <w:top w:w="50" w:type="dxa"/>
+              <w:bottom w:w="50" w:type="dxa"/>
+              <w:left w:w="70" w:type="dxa"/>
+              <w:right w:w="70" w:type="dxa"/>
+            </w:tcMar>
+          </w:tcPr>
+          <w:p>
+            <w:pPr>
+              <w:jc w:val="center"/>
+            </w:pPr>
+            <w:r>
+              <w:rPr>
+                <w:sz w:val="14"/>
+              </w:rPr>
+              <w:t>Docker / Playwright Profiling</w:t>
+            </w:r>
+          </w:p>
+        </w:tc>
+        <w:tc>
+          <w:tcPr>
+            <w:tcW w:type="dxa" w:w="1680"/>
+            <w:shd w:val="clear" w:color="auto" w:fill="ffffff"/>
+            <w:tcMar>
+              <w:top w:w="50" w:type="dxa"/>
+              <w:bottom w:w="50" w:type="dxa"/>
+              <w:left w:w="70" w:type="dxa"/>
+              <w:right w:w="70" w:type="dxa"/>
+            </w:tcMar>
+          </w:tcPr>
+          <w:p>
+            <w:pPr>
+              <w:jc w:val="center"/>
+            </w:pPr>
+            <w:r>
+              <w:rPr>
+                <w:sz w:val="14"/>
+              </w:rPr>
+              <w:t>Browser User Scenarios</w:t>
+            </w:r>
+          </w:p>
+        </w:tc>
+        <w:tc>
+          <w:tcPr>
+            <w:tcW w:type="dxa" w:w="1680"/>
+            <w:shd w:val="clear" w:color="auto" w:fill="ffffff"/>
+            <w:tcMar>
+              <w:top w:w="50" w:type="dxa"/>
+              <w:bottom w:w="50" w:type="dxa"/>
+              <w:left w:w="70" w:type="dxa"/>
+              <w:right w:w="70" w:type="dxa"/>
+            </w:tcMar>
+          </w:tcPr>
+          <w:p>
+            <w:pPr>
+              <w:jc w:val="center"/>
+            </w:pPr>
+            <w:r>
+              <w:rPr>
+                <w:sz w:val="14"/>
+              </w:rPr>
+              <w:t>Scenario g CO2e</w:t>
+            </w:r>
+          </w:p>
+        </w:tc>
+        <w:tc>
+          <w:tcPr>
+            <w:tcW w:type="dxa" w:w="1680"/>
+            <w:shd w:val="clear" w:color="auto" w:fill="ffffff"/>
+            <w:tcMar>
+              <w:top w:w="50" w:type="dxa"/>
+              <w:bottom w:w="50" w:type="dxa"/>
+              <w:left w:w="70" w:type="dxa"/>
+              <w:right w:w="70" w:type="dxa"/>
+            </w:tcMar>
+          </w:tcPr>
+          <w:p>
+            <w:pPr>
+              <w:jc w:val="center"/>
+            </w:pPr>
+            <w:r>
+              <w:rPr>
+                <w:sz w:val="14"/>
+              </w:rPr>
+              <w:t>CI Thresholds</w:t>
+            </w:r>
+          </w:p>
+        </w:tc>
+      </w:tr>
+      <w:tr>
+        <w:tc>
+          <w:tcPr>
+            <w:tcW w:type="dxa" w:w="1680"/>
+            <w:shd w:val="clear" w:color="auto" w:fill="f8fafc"/>
+            <w:tcMar>
+              <w:top w:w="50" w:type="dxa"/>
+              <w:bottom w:w="50" w:type="dxa"/>
+              <w:left w:w="70" w:type="dxa"/>
+              <w:right w:w="70" w:type="dxa"/>
+            </w:tcMar>
+          </w:tcPr>
+          <w:p>
+            <w:pPr>
+              <w:jc w:val="left"/>
+            </w:pPr>
+            <w:r>
+              <w:rPr>
+                <w:b/>
+                <w:sz w:val="15"/>
+              </w:rPr>
+              <w:t xml:space="preserve">FinOps Foundation </w:t>
+            </w:r>
+            <w:hyperlink w:anchor="ref_12" w:history="1">
+              <w:r>
+                <w:rPr>
+                  <w:color w:val="1e40af"/>
+                  <w:b/>
+                  <w:sz w:val="15"/>
+                  <w:u w:val="none"/>
+                </w:rPr>
+                <w:t xml:space="preserve">[12]</w:t>
+              </w:r>
+            </w:hyperlink>
+          </w:p>
+        </w:tc>
+        <w:tc>
+          <w:tcPr>
+            <w:tcW w:type="dxa" w:w="1680"/>
+            <w:shd w:val="clear" w:color="auto" w:fill="f8fafc"/>
+            <w:tcMar>
+              <w:top w:w="50" w:type="dxa"/>
+              <w:bottom w:w="50" w:type="dxa"/>
+              <w:left w:w="70" w:type="dxa"/>
+              <w:right w:w="70" w:type="dxa"/>
+            </w:tcMar>
+          </w:tcPr>
+          <w:p>
+            <w:pPr>
+              <w:jc w:val="center"/>
+            </w:pPr>
+            <w:r>
+              <w:rPr>
+                <w:sz w:val="14"/>
+              </w:rPr>
+              <w:t>Cloud Unit Economics</w:t>
+            </w:r>
+          </w:p>
+        </w:tc>
+        <w:tc>
+          <w:tcPr>
+            <w:tcW w:type="dxa" w:w="1680"/>
+            <w:shd w:val="clear" w:color="auto" w:fill="f8fafc"/>
+            <w:tcMar>
+              <w:top w:w="50" w:type="dxa"/>
+              <w:bottom w:w="50" w:type="dxa"/>
+              <w:left w:w="70" w:type="dxa"/>
+              <w:right w:w="70" w:type="dxa"/>
+            </w:tcMar>
+          </w:tcPr>
+          <w:p>
+            <w:pPr>
+              <w:jc w:val="center"/>
+            </w:pPr>
+            <w:r>
+              <w:rPr>
+                <w:sz w:val="14"/>
+              </w:rPr>
+              <w:t>Cloud Usage &amp; Billing Data</w:t>
+            </w:r>
+          </w:p>
+        </w:tc>
+        <w:tc>
+          <w:tcPr>
+            <w:tcW w:type="dxa" w:w="1680"/>
+            <w:shd w:val="clear" w:color="auto" w:fill="f8fafc"/>
+            <w:tcMar>
+              <w:top w:w="50" w:type="dxa"/>
+              <w:bottom w:w="50" w:type="dxa"/>
+              <w:left w:w="70" w:type="dxa"/>
+              <w:right w:w="70" w:type="dxa"/>
+            </w:tcMar>
+          </w:tcPr>
+          <w:p>
+            <w:pPr>
+              <w:jc w:val="center"/>
+            </w:pPr>
+            <w:r>
+              <w:rPr>
+                <w:sz w:val="14"/>
+              </w:rPr>
+              <w:t>Cloud Technology Services</w:t>
+            </w:r>
+          </w:p>
+        </w:tc>
+        <w:tc>
+          <w:tcPr>
+            <w:tcW w:type="dxa" w:w="1680"/>
+            <w:shd w:val="clear" w:color="auto" w:fill="f8fafc"/>
+            <w:tcMar>
+              <w:top w:w="50" w:type="dxa"/>
+              <w:bottom w:w="50" w:type="dxa"/>
+              <w:left w:w="70" w:type="dxa"/>
+              <w:right w:w="70" w:type="dxa"/>
+            </w:tcMar>
+          </w:tcPr>
+          <w:p>
+            <w:pPr>
+              <w:jc w:val="center"/>
+            </w:pPr>
+            <w:r>
+              <w:rPr>
+                <w:sz w:val="14"/>
+              </w:rPr>
+              <w:t>Carbon / Unit Cost</w:t>
+            </w:r>
+          </w:p>
+        </w:tc>
+        <w:tc>
+          <w:tcPr>
+            <w:tcW w:type="dxa" w:w="1680"/>
+            <w:shd w:val="clear" w:color="auto" w:fill="f8fafc"/>
+            <w:tcMar>
+              <w:top w:w="50" w:type="dxa"/>
+              <w:bottom w:w="50" w:type="dxa"/>
+              <w:left w:w="70" w:type="dxa"/>
+              <w:right w:w="70" w:type="dxa"/>
+            </w:tcMar>
+          </w:tcPr>
+          <w:p>
+            <w:pPr>
+              <w:jc w:val="center"/>
+            </w:pPr>
+            <w:r>
+              <w:rPr>
+                <w:sz w:val="14"/>
+              </w:rPr>
+              <w:t>Governance Framework</w:t>
+            </w:r>
+          </w:p>
+        </w:tc>
+      </w:tr>
+      <w:tr>
+        <w:tc>
+          <w:tcPr>
+            <w:tcW w:type="dxa" w:w="1680"/>
             <w:shd w:val="clear" w:color="auto" w:fill="ecfdf5"/>
             <w:tcMar>
-              <w:top w:w="60" w:type="dxa"/>
-              <w:bottom w:w="60" w:type="dxa"/>
-              <w:left w:w="80" w:type="dxa"/>
-              <w:right w:w="80" w:type="dxa"/>
+              <w:top w:w="50" w:type="dxa"/>
+              <w:bottom w:w="50" w:type="dxa"/>
+              <w:left w:w="70" w:type="dxa"/>
+              <w:right w:w="70" w:type="dxa"/>
             </w:tcMar>
           </w:tcPr>
           <w:p>
@@ -1508,10 +2518,10 @@
             <w:tcW w:type="dxa" w:w="1680"/>
             <w:shd w:val="clear" w:color="auto" w:fill="ecfdf5"/>
             <w:tcMar>
-              <w:top w:w="60" w:type="dxa"/>
-              <w:bottom w:w="60" w:type="dxa"/>
-              <w:left w:w="80" w:type="dxa"/>
-              <w:right w:w="80" w:type="dxa"/>
+              <w:top w:w="50" w:type="dxa"/>
+              <w:bottom w:w="50" w:type="dxa"/>
+              <w:left w:w="70" w:type="dxa"/>
+              <w:right w:w="70" w:type="dxa"/>
             </w:tcMar>
           </w:tcPr>
           <w:p>
@@ -1521,7 +2531,7 @@
             <w:r>
               <w:rPr>
                 <w:b/>
-                <w:sz w:val="15"/>
+                <w:sz w:val="14"/>
               </w:rPr>
               <w:t>Sustainable Banking Core</w:t>
             </w:r>
@@ -1532,10 +2542,10 @@
             <w:tcW w:type="dxa" w:w="1680"/>
             <w:shd w:val="clear" w:color="auto" w:fill="ecfdf5"/>
             <w:tcMar>
-              <w:top w:w="60" w:type="dxa"/>
-              <w:bottom w:w="60" w:type="dxa"/>
-              <w:left w:w="80" w:type="dxa"/>
-              <w:right w:w="80" w:type="dxa"/>
+              <w:top w:w="50" w:type="dxa"/>
+              <w:bottom w:w="50" w:type="dxa"/>
+              <w:left w:w="70" w:type="dxa"/>
+              <w:right w:w="70" w:type="dxa"/>
             </w:tcMar>
           </w:tcPr>
           <w:p>
@@ -1545,7 +2555,7 @@
             <w:r>
               <w:rPr>
                 <w:b/>
-                <w:sz w:val="15"/>
+                <w:sz w:val="14"/>
               </w:rPr>
               <w:t>Kernel eBPF &amp; RAPL Probe</w:t>
             </w:r>
@@ -1556,10 +2566,10 @@
             <w:tcW w:type="dxa" w:w="1680"/>
             <w:shd w:val="clear" w:color="auto" w:fill="ecfdf5"/>
             <w:tcMar>
-              <w:top w:w="60" w:type="dxa"/>
-              <w:bottom w:w="60" w:type="dxa"/>
-              <w:left w:w="80" w:type="dxa"/>
-              <w:right w:w="80" w:type="dxa"/>
+              <w:top w:w="50" w:type="dxa"/>
+              <w:bottom w:w="50" w:type="dxa"/>
+              <w:left w:w="70" w:type="dxa"/>
+              <w:right w:w="70" w:type="dxa"/>
             </w:tcMar>
           </w:tcPr>
           <w:p>
@@ -1569,7 +2579,7 @@
             <w:r>
               <w:rPr>
                 <w:b/>
-                <w:sz w:val="15"/>
+                <w:sz w:val="14"/>
               </w:rPr>
               <w:t>Atomic Double-Entry (DR=CR)</w:t>
             </w:r>
@@ -1580,10 +2590,10 @@
             <w:tcW w:type="dxa" w:w="1680"/>
             <w:shd w:val="clear" w:color="auto" w:fill="ecfdf5"/>
             <w:tcMar>
-              <w:top w:w="60" w:type="dxa"/>
-              <w:bottom w:w="60" w:type="dxa"/>
-              <w:left w:w="80" w:type="dxa"/>
-              <w:right w:w="80" w:type="dxa"/>
+              <w:top w:w="50" w:type="dxa"/>
+              <w:bottom w:w="50" w:type="dxa"/>
+              <w:left w:w="70" w:type="dxa"/>
+              <w:right w:w="70" w:type="dxa"/>
             </w:tcMar>
           </w:tcPr>
           <w:p>
@@ -1593,7 +2603,7 @@
             <w:r>
               <w:rPr>
                 <w:b/>
-                <w:sz w:val="15"/>
+                <w:sz w:val="14"/>
               </w:rPr>
               <w:t>Real-Time mg CO2/Tx</w:t>
             </w:r>
@@ -1604,10 +2614,10 @@
             <w:tcW w:type="dxa" w:w="1680"/>
             <w:shd w:val="clear" w:color="auto" w:fill="ecfdf5"/>
             <w:tcMar>
-              <w:top w:w="60" w:type="dxa"/>
-              <w:bottom w:w="60" w:type="dxa"/>
-              <w:left w:w="80" w:type="dxa"/>
-              <w:right w:w="80" w:type="dxa"/>
+              <w:top w:w="50" w:type="dxa"/>
+              <w:bottom w:w="50" w:type="dxa"/>
+              <w:left w:w="70" w:type="dxa"/>
+              <w:right w:w="70" w:type="dxa"/>
             </w:tcMar>
           </w:tcPr>
           <w:p>
@@ -1617,7 +2627,7 @@
             <w:r>
               <w:rPr>
                 <w:b/>
-                <w:sz w:val="15"/>
+                <w:sz w:val="14"/>
               </w:rPr>
               <w:t>SHA-256 Chained Hashes</w:t>
             </w:r>
@@ -1640,21 +2650,22 @@
     </w:p>
     <w:p>
       <w:pPr>
-        <w:spacing w:before="280" w:after="80"/>
-        <w:jc w:val="left"/>
+        <w:keepNext/>
+        <w:spacing w:before="240" w:after="80"/>
       </w:pPr>
       <w:r>
         <w:rPr>
           <w:rFonts w:ascii="Times New Roman" w:hAnsi="Times New Roman"/>
           <w:b/>
-          <w:sz w:val="22"/>
+          <w:color w:val="0F172A"/>
+          <w:sz w:val="21"/>
         </w:rPr>
         <w:t>III. GREEN-FINANCE ARCHITECTURE &amp; MATHEMATICAL FORMULATION</w:t>
       </w:r>
     </w:p>
     <w:p>
       <w:pPr>
-        <w:spacing w:before="0" w:after="120"/>
+        <w:spacing w:before="0" w:after="80" w:line="259" w:lineRule="auto"/>
         <w:jc w:val="both"/>
       </w:pPr>
       <w:r>
@@ -1721,14 +2732,15 @@
     </w:p>
     <w:p>
       <w:pPr>
-        <w:spacing w:before="200" w:after="60"/>
-        <w:jc w:val="left"/>
+        <w:keepNext/>
+        <w:spacing w:before="160" w:after="60"/>
       </w:pPr>
       <w:r>
         <w:rPr>
           <w:rFonts w:ascii="Times New Roman" w:hAnsi="Times New Roman"/>
           <w:b/>
           <w:i/>
+          <w:color w:val="1E293B"/>
           <w:sz w:val="20"/>
         </w:rPr>
         <w:t>A. Mathematical Formulation of the Double-Entry Ledger</w:t>
@@ -1736,7 +2748,7 @@
     </w:p>
     <w:p>
       <w:pPr>
-        <w:spacing w:before="0" w:after="120"/>
+        <w:spacing w:before="0" w:after="80" w:line="259" w:lineRule="auto"/>
         <w:jc w:val="both"/>
       </w:pPr>
       <w:r>
@@ -1749,7 +2761,7 @@
     </w:p>
     <w:p>
       <w:pPr>
-        <w:spacing w:before="0" w:after="120"/>
+        <w:spacing w:before="0" w:after="80" w:line="259" w:lineRule="auto"/>
         <w:jc w:val="both"/>
       </w:pPr>
       <w:r>
@@ -1764,6 +2776,7 @@
       <w:tblPr>
         <w:tblW w:type="auto" w:w="0"/>
         <w:jc w:val="center"/>
+        <w:tblLayout w:type="autofit"/>
         <w:tblLook w:firstColumn="1" w:firstRow="1" w:lastColumn="0" w:lastRow="0" w:noHBand="0" w:noVBand="1" w:val="04A0"/>
       </w:tblPr>
       <w:tblGrid>
@@ -1773,7 +2786,7 @@
       <w:tr>
         <w:tc>
           <w:tcPr>
-            <w:tcW w:type="dxa" w:w="5040"/>
+            <w:tcW w:type="dxa" w:w="8352"/>
             <w:tcBorders>
               <w:top w:val="none"/>
               <w:left w:val="none"/>
@@ -1798,7 +2811,7 @@
         </w:tc>
         <w:tc>
           <w:tcPr>
-            <w:tcW w:type="dxa" w:w="5040"/>
+            <w:tcW w:type="dxa" w:w="1008"/>
             <w:tcBorders>
               <w:top w:val="none"/>
               <w:left w:val="none"/>
@@ -1823,7 +2836,7 @@
     </w:tbl>
     <w:p>
       <w:pPr>
-        <w:spacing w:before="0" w:after="120"/>
+        <w:spacing w:before="0" w:after="80" w:line="259" w:lineRule="auto"/>
         <w:jc w:val="both"/>
       </w:pPr>
       <w:r>
@@ -1838,6 +2851,7 @@
       <w:tblPr>
         <w:tblW w:type="auto" w:w="0"/>
         <w:jc w:val="center"/>
+        <w:tblLayout w:type="autofit"/>
         <w:tblLook w:firstColumn="1" w:firstRow="1" w:lastColumn="0" w:lastRow="0" w:noHBand="0" w:noVBand="1" w:val="04A0"/>
       </w:tblPr>
       <w:tblGrid>
@@ -1847,7 +2861,7 @@
       <w:tr>
         <w:tc>
           <w:tcPr>
-            <w:tcW w:type="dxa" w:w="5040"/>
+            <w:tcW w:type="dxa" w:w="8352"/>
             <w:tcBorders>
               <w:top w:val="none"/>
               <w:left w:val="none"/>
@@ -1872,7 +2886,7 @@
         </w:tc>
         <w:tc>
           <w:tcPr>
-            <w:tcW w:type="dxa" w:w="5040"/>
+            <w:tcW w:type="dxa" w:w="1008"/>
             <w:tcBorders>
               <w:top w:val="none"/>
               <w:left w:val="none"/>
@@ -1897,7 +2911,7 @@
     </w:tbl>
     <w:p>
       <w:pPr>
-        <w:spacing w:before="0" w:after="120"/>
+        <w:spacing w:before="0" w:after="80" w:line="259" w:lineRule="auto"/>
         <w:jc w:val="both"/>
       </w:pPr>
       <w:r>
@@ -1910,21 +2924,22 @@
     </w:p>
     <w:p>
       <w:pPr>
-        <w:spacing w:before="280" w:after="80"/>
-        <w:jc w:val="left"/>
+        <w:keepNext/>
+        <w:spacing w:before="240" w:after="80"/>
       </w:pPr>
       <w:r>
         <w:rPr>
           <w:rFonts w:ascii="Times New Roman" w:hAnsi="Times New Roman"/>
           <w:b/>
-          <w:sz w:val="22"/>
+          <w:color w:val="0F172A"/>
+          <w:sz w:val="21"/>
         </w:rPr>
         <w:t>IV. KERNEL-LEVEL ENERGY TELEMETRY &amp; CARBON ATTRIBUTION ENGINE</w:t>
       </w:r>
     </w:p>
     <w:p>
       <w:pPr>
-        <w:spacing w:before="0" w:after="120"/>
+        <w:spacing w:before="0" w:after="80" w:line="259" w:lineRule="auto"/>
         <w:jc w:val="both"/>
       </w:pPr>
       <w:r>
@@ -1991,14 +3006,15 @@
     </w:p>
     <w:p>
       <w:pPr>
-        <w:spacing w:before="200" w:after="60"/>
-        <w:jc w:val="left"/>
+        <w:keepNext/>
+        <w:spacing w:before="160" w:after="60"/>
       </w:pPr>
       <w:r>
         <w:rPr>
           <w:rFonts w:ascii="Times New Roman" w:hAnsi="Times New Roman"/>
           <w:b/>
           <w:i/>
+          <w:color w:val="1E293B"/>
           <w:sz w:val="20"/>
         </w:rPr>
         <w:t>A. Hardware Sensor Interfacing via Intel RAPL</w:t>
@@ -2006,7 +3022,7 @@
     </w:p>
     <w:p>
       <w:pPr>
-        <w:spacing w:before="0" w:after="120"/>
+        <w:spacing w:before="0" w:after="80" w:line="259" w:lineRule="auto"/>
         <w:jc w:val="both"/>
       </w:pPr>
       <w:r>
@@ -2019,7 +3035,7 @@
     </w:p>
     <w:p>
       <w:pPr>
-        <w:spacing w:before="0" w:after="120"/>
+        <w:spacing w:before="0" w:after="80" w:line="259" w:lineRule="auto"/>
         <w:jc w:val="both"/>
       </w:pPr>
       <w:r>
@@ -2032,14 +3048,15 @@
     </w:p>
     <w:p>
       <w:pPr>
-        <w:spacing w:before="200" w:after="60"/>
-        <w:jc w:val="left"/>
+        <w:keepNext/>
+        <w:spacing w:before="160" w:after="60"/>
       </w:pPr>
       <w:r>
         <w:rPr>
           <w:rFonts w:ascii="Times New Roman" w:hAnsi="Times New Roman"/>
           <w:b/>
           <w:i/>
+          <w:color w:val="1E293B"/>
           <w:sz w:val="20"/>
         </w:rPr>
         <w:t>B. Dynamic Carbon-per-Transaction Derivation</w:t>
@@ -2047,7 +3064,7 @@
     </w:p>
     <w:p>
       <w:pPr>
-        <w:spacing w:before="0" w:after="120"/>
+        <w:spacing w:before="0" w:after="80" w:line="259" w:lineRule="auto"/>
         <w:jc w:val="both"/>
       </w:pPr>
       <w:r>
@@ -2055,13 +3072,50 @@
           <w:rFonts w:ascii="Times New Roman" w:hAnsi="Times New Roman"/>
           <w:sz w:val="20"/>
         </w:rPr>
-        <w:t>In accordance with ISO/IEC 21031 (SCI) and the GHG Protocol Corporate Standard (Scope 2 location-based accounting), Green-Finance derives the carbon footprint of transactional workloads dynamically. Let Delta E_service(W) denote the total energy consumed by the financial microservice container during a measurement time window W (in Joules), and let N_tx(W) denote the count of successfully committed transactions within that window. The operational energy per transaction E_tx (in kilowatt-hours) is expressed as:</w:t>
+        <w:t xml:space="preserve">In accordance with ISO/IEC 21031 (SCI) </w:t>
+      </w:r>
+      <w:hyperlink w:anchor="ref_10" w:history="1">
+        <w:r>
+          <w:rPr>
+            <w:color w:val="1e40af"/>
+            <w:b/>
+            <w:sz w:val="20"/>
+            <w:u w:val="none"/>
+          </w:rPr>
+          <w:t xml:space="preserve">[10]</w:t>
+        </w:r>
+      </w:hyperlink>
+      <w:r>
+        <w:rPr>
+          <w:rFonts w:ascii="Times New Roman" w:hAnsi="Times New Roman"/>
+          <w:sz w:val="20"/>
+        </w:rPr>
+        <w:t xml:space="preserve"> and the GHG Protocol Corporate Standard (Scope 2 location-based accounting) </w:t>
+      </w:r>
+      <w:hyperlink w:anchor="ref_14" w:history="1">
+        <w:r>
+          <w:rPr>
+            <w:color w:val="1e40af"/>
+            <w:b/>
+            <w:sz w:val="20"/>
+            <w:u w:val="none"/>
+          </w:rPr>
+          <w:t xml:space="preserve">[14]</w:t>
+        </w:r>
+      </w:hyperlink>
+      <w:r>
+        <w:rPr>
+          <w:rFonts w:ascii="Times New Roman" w:hAnsi="Times New Roman"/>
+          <w:sz w:val="20"/>
+        </w:rPr>
+        <w:t>, Green-Finance derives the carbon footprint of transactional workloads dynamically. Let Delta E_service(W) denote the total energy consumed by the financial microservice container during a measurement time window W (in Joules), and let N_tx(W) denote the count of successfully committed transactions within that window. The operational energy per transaction E_tx (in kilowatt-hours) is expressed as:</w:t>
       </w:r>
     </w:p>
     <w:tbl>
       <w:tblPr>
         <w:tblW w:type="auto" w:w="0"/>
         <w:jc w:val="center"/>
+        <w:tblLayout w:type="autofit"/>
         <w:tblLook w:firstColumn="1" w:firstRow="1" w:lastColumn="0" w:lastRow="0" w:noHBand="0" w:noVBand="1" w:val="04A0"/>
       </w:tblPr>
       <w:tblGrid>
@@ -2071,7 +3125,7 @@
       <w:tr>
         <w:tc>
           <w:tcPr>
-            <w:tcW w:type="dxa" w:w="5040"/>
+            <w:tcW w:type="dxa" w:w="8352"/>
             <w:tcBorders>
               <w:top w:val="none"/>
               <w:left w:val="none"/>
@@ -2096,7 +3150,7 @@
         </w:tc>
         <w:tc>
           <w:tcPr>
-            <w:tcW w:type="dxa" w:w="5040"/>
+            <w:tcW w:type="dxa" w:w="1008"/>
             <w:tcBorders>
               <w:top w:val="none"/>
               <w:left w:val="none"/>
@@ -2121,7 +3175,7 @@
     </w:tbl>
     <w:p>
       <w:pPr>
-        <w:spacing w:before="0" w:after="120"/>
+        <w:spacing w:before="0" w:after="80" w:line="259" w:lineRule="auto"/>
         <w:jc w:val="both"/>
       </w:pPr>
       <w:r>
@@ -2136,6 +3190,7 @@
       <w:tblPr>
         <w:tblW w:type="auto" w:w="0"/>
         <w:jc w:val="center"/>
+        <w:tblLayout w:type="autofit"/>
         <w:tblLook w:firstColumn="1" w:firstRow="1" w:lastColumn="0" w:lastRow="0" w:noHBand="0" w:noVBand="1" w:val="04A0"/>
       </w:tblPr>
       <w:tblGrid>
@@ -2145,7 +3200,7 @@
       <w:tr>
         <w:tc>
           <w:tcPr>
-            <w:tcW w:type="dxa" w:w="5040"/>
+            <w:tcW w:type="dxa" w:w="8352"/>
             <w:tcBorders>
               <w:top w:val="none"/>
               <w:left w:val="none"/>
@@ -2170,7 +3225,7 @@
         </w:tc>
         <w:tc>
           <w:tcPr>
-            <w:tcW w:type="dxa" w:w="5040"/>
+            <w:tcW w:type="dxa" w:w="1008"/>
             <w:tcBorders>
               <w:top w:val="none"/>
               <w:left w:val="none"/>
@@ -2195,7 +3250,7 @@
     </w:tbl>
     <w:p>
       <w:pPr>
-        <w:spacing w:before="0" w:after="120"/>
+        <w:spacing w:before="0" w:after="80" w:line="259" w:lineRule="auto"/>
         <w:jc w:val="both"/>
       </w:pPr>
       <w:r>
@@ -2203,26 +3258,45 @@
           <w:rFonts w:ascii="Times New Roman" w:hAnsi="Times New Roman"/>
           <w:sz w:val="20"/>
         </w:rPr>
-        <w:t>For the Indian banking sector, Green-Finance configures I_grid = 713 gCO2/kWh, derived from the Central Electricity Authority (CEA) CO2 Baseline Database for the Indian Power Sector (Version 19, weighted average national grid emission factor). Both the grid factor and window duration (10s, 60s, 300s) are versioned and dynamically queryable via Prometheus PromQL derivations.</w:t>
+        <w:t xml:space="preserve">For the Indian banking sector, Green-Finance configures I_grid = 713 gCO2/kWh, derived from the Central Electricity Authority (CEA) CO2 Baseline Database for the Indian Power Sector (Version 19, weighted average national grid emission factor) </w:t>
+      </w:r>
+      <w:hyperlink w:anchor="ref_13" w:history="1">
+        <w:r>
+          <w:rPr>
+            <w:color w:val="1e40af"/>
+            <w:b/>
+            <w:sz w:val="20"/>
+            <w:u w:val="none"/>
+          </w:rPr>
+          <w:t xml:space="preserve">[13]</w:t>
+        </w:r>
+      </w:hyperlink>
+      <w:r>
+        <w:rPr>
+          <w:rFonts w:ascii="Times New Roman" w:hAnsi="Times New Roman"/>
+          <w:sz w:val="20"/>
+        </w:rPr>
+        <w:t>. Both the grid factor and window duration (10s, 60s, 300s) are versioned and dynamically queryable via Prometheus PromQL derivations.</w:t>
       </w:r>
     </w:p>
     <w:p>
       <w:pPr>
-        <w:spacing w:before="280" w:after="80"/>
-        <w:jc w:val="left"/>
+        <w:keepNext/>
+        <w:spacing w:before="240" w:after="80"/>
       </w:pPr>
       <w:r>
         <w:rPr>
           <w:rFonts w:ascii="Times New Roman" w:hAnsi="Times New Roman"/>
           <w:b/>
-          <w:sz w:val="22"/>
+          <w:color w:val="0F172A"/>
+          <w:sz w:val="21"/>
         </w:rPr>
         <w:t>V. SECURITY HARDENING, CRYPTOGRAPHIC AUDIT TRAILS &amp; HIERARCHICAL RBAC</w:t>
       </w:r>
     </w:p>
     <w:p>
       <w:pPr>
-        <w:spacing w:before="0" w:after="120"/>
+        <w:spacing w:before="0" w:after="80" w:line="259" w:lineRule="auto"/>
         <w:jc w:val="both"/>
       </w:pPr>
       <w:r>
@@ -2230,19 +3304,38 @@
           <w:rFonts w:ascii="Times New Roman" w:hAnsi="Times New Roman"/>
           <w:sz w:val="20"/>
         </w:rPr>
-        <w:t>Financial systems require rigorous defense against unauthorized balance tampering, privilege escalation, and credential theft. Green-Finance implements a comprehensive defense-in-depth architecture adhering to OWASP ASVS 5.0.0 (Level 2) and the OWASP API Security Top 10.</w:t>
+        <w:t xml:space="preserve">Financial systems require rigorous defense against unauthorized balance tampering, privilege escalation, and credential theft. Green-Finance implements a comprehensive defense-in-depth architecture adhering to OWASP ASVS 5.0.0 (Level 2) </w:t>
+      </w:r>
+      <w:hyperlink w:anchor="ref_15" w:history="1">
+        <w:r>
+          <w:rPr>
+            <w:color w:val="1e40af"/>
+            <w:b/>
+            <w:sz w:val="20"/>
+            <w:u w:val="none"/>
+          </w:rPr>
+          <w:t xml:space="preserve">[15]</w:t>
+        </w:r>
+      </w:hyperlink>
+      <w:r>
+        <w:rPr>
+          <w:rFonts w:ascii="Times New Roman" w:hAnsi="Times New Roman"/>
+          <w:sz w:val="20"/>
+        </w:rPr>
+        <w:t xml:space="preserve"> and the OWASP API Security Top 10.</w:t>
       </w:r>
     </w:p>
     <w:p>
       <w:pPr>
-        <w:spacing w:before="200" w:after="60"/>
-        <w:jc w:val="left"/>
+        <w:keepNext/>
+        <w:spacing w:before="160" w:after="60"/>
       </w:pPr>
       <w:r>
         <w:rPr>
           <w:rFonts w:ascii="Times New Roman" w:hAnsi="Times New Roman"/>
           <w:b/>
           <w:i/>
+          <w:color w:val="1E293B"/>
           <w:sz w:val="20"/>
         </w:rPr>
         <w:t>A. Cryptographic SHA-256 Tamper-Evident Hash Chaining</w:t>
@@ -2250,7 +3343,7 @@
     </w:p>
     <w:p>
       <w:pPr>
-        <w:spacing w:before="0" w:after="120"/>
+        <w:spacing w:before="0" w:after="80" w:line="259" w:lineRule="auto"/>
         <w:jc w:val="both"/>
       </w:pPr>
       <w:r>
@@ -2265,6 +3358,7 @@
       <w:tblPr>
         <w:tblW w:type="auto" w:w="0"/>
         <w:jc w:val="center"/>
+        <w:tblLayout w:type="autofit"/>
         <w:tblLook w:firstColumn="1" w:firstRow="1" w:lastColumn="0" w:lastRow="0" w:noHBand="0" w:noVBand="1" w:val="04A0"/>
       </w:tblPr>
       <w:tblGrid>
@@ -2274,7 +3368,7 @@
       <w:tr>
         <w:tc>
           <w:tcPr>
-            <w:tcW w:type="dxa" w:w="5040"/>
+            <w:tcW w:type="dxa" w:w="8352"/>
             <w:tcBorders>
               <w:top w:val="none"/>
               <w:left w:val="none"/>
@@ -2299,7 +3393,7 @@
         </w:tc>
         <w:tc>
           <w:tcPr>
-            <w:tcW w:type="dxa" w:w="5040"/>
+            <w:tcW w:type="dxa" w:w="1008"/>
             <w:tcBorders>
               <w:top w:val="none"/>
               <w:left w:val="none"/>
@@ -2324,7 +3418,7 @@
     </w:tbl>
     <w:p>
       <w:pPr>
-        <w:spacing w:before="0" w:after="120"/>
+        <w:spacing w:before="0" w:after="80" w:line="259" w:lineRule="auto"/>
         <w:jc w:val="both"/>
       </w:pPr>
       <w:r>
@@ -2337,14 +3431,15 @@
     </w:p>
     <w:p>
       <w:pPr>
-        <w:spacing w:before="200" w:after="60"/>
-        <w:jc w:val="left"/>
+        <w:keepNext/>
+        <w:spacing w:before="160" w:after="60"/>
       </w:pPr>
       <w:r>
         <w:rPr>
           <w:rFonts w:ascii="Times New Roman" w:hAnsi="Times New Roman"/>
           <w:b/>
           <w:i/>
+          <w:color w:val="1E293B"/>
           <w:sz w:val="20"/>
         </w:rPr>
         <w:t>B. Four-Tier Hierarchical RBAC &amp; Ceiling Enforcement</w:t>
@@ -2352,7 +3447,7 @@
     </w:p>
     <w:p>
       <w:pPr>
-        <w:spacing w:before="0" w:after="120"/>
+        <w:spacing w:before="0" w:after="80" w:line="259" w:lineRule="auto"/>
         <w:jc w:val="both"/>
       </w:pPr>
       <w:r>
@@ -2419,7 +3514,7 @@
     </w:p>
     <w:p>
       <w:pPr>
-        <w:spacing w:before="0" w:after="120"/>
+        <w:spacing w:before="0" w:after="80" w:line="259" w:lineRule="auto"/>
         <w:jc w:val="both"/>
       </w:pPr>
       <w:r>
@@ -2432,7 +3527,7 @@
     </w:p>
     <w:p>
       <w:pPr>
-        <w:spacing w:before="0" w:after="120"/>
+        <w:spacing w:before="0" w:after="80" w:line="259" w:lineRule="auto"/>
         <w:jc w:val="both"/>
       </w:pPr>
       <w:r>
@@ -2445,7 +3540,7 @@
     </w:p>
     <w:p>
       <w:pPr>
-        <w:spacing w:before="0" w:after="120"/>
+        <w:spacing w:before="0" w:after="80" w:line="259" w:lineRule="auto"/>
         <w:jc w:val="both"/>
       </w:pPr>
       <w:r>
@@ -2458,7 +3553,7 @@
     </w:p>
     <w:p>
       <w:pPr>
-        <w:spacing w:before="0" w:after="120"/>
+        <w:spacing w:before="0" w:after="80" w:line="259" w:lineRule="auto"/>
         <w:jc w:val="both"/>
       </w:pPr>
       <w:r>
@@ -2471,21 +3566,22 @@
     </w:p>
     <w:p>
       <w:pPr>
-        <w:spacing w:before="280" w:after="80"/>
-        <w:jc w:val="left"/>
+        <w:keepNext/>
+        <w:spacing w:before="240" w:after="80"/>
       </w:pPr>
       <w:r>
         <w:rPr>
           <w:rFonts w:ascii="Times New Roman" w:hAnsi="Times New Roman"/>
           <w:b/>
-          <w:sz w:val="22"/>
+          <w:color w:val="0F172A"/>
+          <w:sz w:val="21"/>
         </w:rPr>
         <w:t>VI. EXPERIMENTAL EVALUATION &amp; BENCHMARK RESULTS</w:t>
       </w:r>
     </w:p>
     <w:p>
       <w:pPr>
-        <w:spacing w:before="0" w:after="120"/>
+        <w:spacing w:before="0" w:after="80" w:line="259" w:lineRule="auto"/>
         <w:jc w:val="both"/>
       </w:pPr>
       <w:r>
@@ -2552,14 +3648,15 @@
     </w:p>
     <w:p>
       <w:pPr>
-        <w:spacing w:before="200" w:after="60"/>
-        <w:jc w:val="left"/>
+        <w:keepNext/>
+        <w:spacing w:before="160" w:after="60"/>
       </w:pPr>
       <w:r>
         <w:rPr>
           <w:rFonts w:ascii="Times New Roman" w:hAnsi="Times New Roman"/>
           <w:b/>
           <w:i/>
+          <w:color w:val="1E293B"/>
           <w:sz w:val="20"/>
         </w:rPr>
         <w:t>A. Energy Conservation and Attribution Fidelity</w:t>
@@ -2567,7 +3664,7 @@
     </w:p>
     <w:p>
       <w:pPr>
-        <w:spacing w:before="0" w:after="120"/>
+        <w:spacing w:before="0" w:after="80" w:line="259" w:lineRule="auto"/>
         <w:jc w:val="both"/>
       </w:pPr>
       <w:r>
@@ -2582,6 +3679,7 @@
       <w:tblPr>
         <w:tblW w:type="auto" w:w="0"/>
         <w:jc w:val="center"/>
+        <w:tblLayout w:type="autofit"/>
         <w:tblLook w:firstColumn="1" w:firstRow="1" w:lastColumn="0" w:lastRow="0" w:noHBand="0" w:noVBand="1" w:val="04A0"/>
       </w:tblPr>
       <w:tblGrid>
@@ -2591,7 +3689,7 @@
       <w:tr>
         <w:tc>
           <w:tcPr>
-            <w:tcW w:type="dxa" w:w="5040"/>
+            <w:tcW w:type="dxa" w:w="8352"/>
             <w:tcBorders>
               <w:top w:val="none"/>
               <w:left w:val="none"/>
@@ -2616,7 +3714,7 @@
         </w:tc>
         <w:tc>
           <w:tcPr>
-            <w:tcW w:type="dxa" w:w="5040"/>
+            <w:tcW w:type="dxa" w:w="1008"/>
             <w:tcBorders>
               <w:top w:val="none"/>
               <w:left w:val="none"/>
@@ -2641,14 +3739,15 @@
     </w:tbl>
     <w:p>
       <w:pPr>
-        <w:spacing w:before="200" w:after="60"/>
-        <w:jc w:val="left"/>
+        <w:keepNext/>
+        <w:spacing w:before="160" w:after="60"/>
       </w:pPr>
       <w:r>
         <w:rPr>
           <w:rFonts w:ascii="Times New Roman" w:hAnsi="Times New Roman"/>
           <w:b/>
           <w:i/>
+          <w:color w:val="1E293B"/>
           <w:sz w:val="20"/>
         </w:rPr>
         <w:t>B. Carbon-per-Transaction Concurrency Scaling</w:t>
@@ -2656,7 +3755,7 @@
     </w:p>
     <w:p>
       <w:pPr>
-        <w:spacing w:before="0" w:after="120"/>
+        <w:spacing w:before="0" w:after="80" w:line="259" w:lineRule="auto"/>
         <w:jc w:val="both"/>
       </w:pPr>
       <w:r>
@@ -2669,14 +3768,15 @@
     </w:p>
     <w:p>
       <w:pPr>
-        <w:spacing w:before="200" w:after="60"/>
-        <w:jc w:val="left"/>
+        <w:keepNext/>
+        <w:spacing w:before="160" w:after="60"/>
       </w:pPr>
       <w:r>
         <w:rPr>
           <w:rFonts w:ascii="Times New Roman" w:hAnsi="Times New Roman"/>
           <w:b/>
           <w:i/>
+          <w:color w:val="1E293B"/>
           <w:sz w:val="20"/>
         </w:rPr>
         <w:t>C. Measurement Repeatability and Coefficient of Variation</w:t>
@@ -2684,7 +3784,7 @@
     </w:p>
     <w:p>
       <w:pPr>
-        <w:spacing w:before="0" w:after="120"/>
+        <w:spacing w:before="0" w:after="80" w:line="259" w:lineRule="auto"/>
         <w:jc w:val="both"/>
       </w:pPr>
       <w:r>
@@ -2699,6 +3799,7 @@
       <w:tblPr>
         <w:tblW w:type="auto" w:w="0"/>
         <w:jc w:val="center"/>
+        <w:tblLayout w:type="autofit"/>
         <w:tblLook w:firstColumn="1" w:firstRow="1" w:lastColumn="0" w:lastRow="0" w:noHBand="0" w:noVBand="1" w:val="04A0"/>
       </w:tblPr>
       <w:tblGrid>
@@ -2708,7 +3809,7 @@
       <w:tr>
         <w:tc>
           <w:tcPr>
-            <w:tcW w:type="dxa" w:w="5040"/>
+            <w:tcW w:type="dxa" w:w="8352"/>
             <w:tcBorders>
               <w:top w:val="none"/>
               <w:left w:val="none"/>
@@ -2733,7 +3834,7 @@
         </w:tc>
         <w:tc>
           <w:tcPr>
-            <w:tcW w:type="dxa" w:w="5040"/>
+            <w:tcW w:type="dxa" w:w="1008"/>
             <w:tcBorders>
               <w:top w:val="none"/>
               <w:left w:val="none"/>
@@ -2758,7 +3859,7 @@
     </w:tbl>
     <w:p>
       <w:pPr>
-        <w:spacing w:before="0" w:after="120"/>
+        <w:spacing w:before="0" w:after="80" w:line="259" w:lineRule="auto"/>
         <w:jc w:val="both"/>
       </w:pPr>
       <w:r>
@@ -2771,14 +3872,15 @@
     </w:p>
     <w:p>
       <w:pPr>
-        <w:spacing w:before="200" w:after="60"/>
-        <w:jc w:val="left"/>
+        <w:keepNext/>
+        <w:spacing w:before="160" w:after="60"/>
       </w:pPr>
       <w:r>
         <w:rPr>
           <w:rFonts w:ascii="Times New Roman" w:hAnsi="Times New Roman"/>
           <w:b/>
           <w:i/>
+          <w:color w:val="1E293B"/>
           <w:sz w:val="20"/>
         </w:rPr>
         <w:t>D. Latency and Security Overhead</w:t>
@@ -2786,7 +3888,7 @@
     </w:p>
     <w:p>
       <w:pPr>
-        <w:spacing w:before="0" w:after="120"/>
+        <w:spacing w:before="0" w:after="80" w:line="259" w:lineRule="auto"/>
         <w:jc w:val="both"/>
       </w:pPr>
       <w:r>
@@ -2799,7 +3901,7 @@
     </w:p>
     <w:p>
       <w:pPr>
-        <w:spacing w:before="0" w:after="120"/>
+        <w:spacing w:before="0" w:after="80" w:line="259" w:lineRule="auto"/>
         <w:jc w:val="both"/>
       </w:pPr>
       <w:r>
@@ -3552,21 +4654,22 @@
     </w:p>
     <w:p>
       <w:pPr>
-        <w:spacing w:before="280" w:after="80"/>
-        <w:jc w:val="left"/>
+        <w:keepNext/>
+        <w:spacing w:before="240" w:after="80"/>
       </w:pPr>
       <w:r>
         <w:rPr>
           <w:rFonts w:ascii="Times New Roman" w:hAnsi="Times New Roman"/>
           <w:b/>
-          <w:sz w:val="22"/>
+          <w:color w:val="0F172A"/>
+          <w:sz w:val="21"/>
         </w:rPr>
         <w:t>VII. DISCUSSION, REGULATORY COMPLIANCE &amp; LIMITATIONS</w:t>
       </w:r>
     </w:p>
     <w:p>
       <w:pPr>
-        <w:spacing w:before="0" w:after="120"/>
+        <w:spacing w:before="0" w:after="80" w:line="259" w:lineRule="auto"/>
         <w:jc w:val="both"/>
       </w:pPr>
       <w:r>
@@ -3574,12 +4677,48 @@
           <w:rFonts w:ascii="Times New Roman" w:hAnsi="Times New Roman"/>
           <w:sz w:val="20"/>
         </w:rPr>
-        <w:t>The empirical findings demonstrate that Green-Finance operationalizes the principles of ISO/IEC 21031 (SCI) and FinOps sustainability guidelines within a production financial environment. By attributing Scope 2 carbon to individual transactions, financial institutions can transition from static annual corporate estimates to dynamic, continuous carbon accounting. Moreover, printable receipts featuring cryptographic SHA-256 hashes and explicit telemetry mode provenance provide audited transparency for ESG regulators.</w:t>
+        <w:t xml:space="preserve">The empirical findings demonstrate that Green-Finance operationalizes the principles of ISO/IEC 21031 (SCI) </w:t>
+      </w:r>
+      <w:hyperlink w:anchor="ref_10" w:history="1">
+        <w:r>
+          <w:rPr>
+            <w:color w:val="1e40af"/>
+            <w:b/>
+            <w:sz w:val="20"/>
+            <w:u w:val="none"/>
+          </w:rPr>
+          <w:t xml:space="preserve">[10]</w:t>
+        </w:r>
+      </w:hyperlink>
+      <w:r>
+        <w:rPr>
+          <w:rFonts w:ascii="Times New Roman" w:hAnsi="Times New Roman"/>
+          <w:sz w:val="20"/>
+        </w:rPr>
+        <w:t xml:space="preserve"> and FinOps sustainability guidelines </w:t>
+      </w:r>
+      <w:hyperlink w:anchor="ref_12" w:history="1">
+        <w:r>
+          <w:rPr>
+            <w:color w:val="1e40af"/>
+            <w:b/>
+            <w:sz w:val="20"/>
+            <w:u w:val="none"/>
+          </w:rPr>
+          <w:t xml:space="preserve">[12]</w:t>
+        </w:r>
+      </w:hyperlink>
+      <w:r>
+        <w:rPr>
+          <w:rFonts w:ascii="Times New Roman" w:hAnsi="Times New Roman"/>
+          <w:sz w:val="20"/>
+        </w:rPr>
+        <w:t xml:space="preserve"> within a production financial environment. By attributing Scope 2 carbon to individual transactions, financial institutions can transition from static annual corporate estimates to dynamic, continuous carbon accounting. Moreover, printable receipts featuring cryptographic SHA-256 hashes and explicit telemetry mode provenance provide audited transparency for ESG regulators.</w:t>
       </w:r>
     </w:p>
     <w:p>
       <w:pPr>
-        <w:spacing w:before="0" w:after="120"/>
+        <w:spacing w:before="0" w:after="80" w:line="259" w:lineRule="auto"/>
         <w:jc w:val="both"/>
       </w:pPr>
       <w:r>
@@ -3592,21 +4731,22 @@
     </w:p>
     <w:p>
       <w:pPr>
-        <w:spacing w:before="280" w:after="80"/>
-        <w:jc w:val="left"/>
+        <w:keepNext/>
+        <w:spacing w:before="240" w:after="80"/>
       </w:pPr>
       <w:r>
         <w:rPr>
           <w:rFonts w:ascii="Times New Roman" w:hAnsi="Times New Roman"/>
           <w:b/>
-          <w:sz w:val="22"/>
+          <w:color w:val="0F172A"/>
+          <w:sz w:val="21"/>
         </w:rPr>
         <w:t>VIII. CONCLUSION &amp; FUTURE WORK</w:t>
       </w:r>
     </w:p>
     <w:p>
       <w:pPr>
-        <w:spacing w:before="0" w:after="120"/>
+        <w:spacing w:before="0" w:after="80" w:line="259" w:lineRule="auto"/>
         <w:jc w:val="both"/>
       </w:pPr>
       <w:r>
@@ -3614,12 +4754,30 @@
           <w:rFonts w:ascii="Times New Roman" w:hAnsi="Times New Roman"/>
           <w:sz w:val="20"/>
         </w:rPr>
-        <w:t>This paper presented Green-Finance, an end-to-end framework integrating financial double-entry ledger processing with kernel-level eBPF/RAPL energy telemetry, dynamic ISO/IEC 21031 carbon derivation, cryptographic SHA-256 hash chaining, and hierarchical RBAC. Experimental benchmarks validate that the framework achieves 96.2% energy attribution fidelity, a low repeatability CV of 3.22%, an average emission rate of 0.134 to 0.184 mg CO2 per transaction, and negligible latency overhead of under 1.8%.</w:t>
+        <w:t xml:space="preserve">This paper presented Green-Finance, an end-to-end framework integrating financial double-entry ledger processing with kernel-level eBPF/RAPL energy telemetry, dynamic ISO/IEC 21031 carbon derivation </w:t>
+      </w:r>
+      <w:hyperlink w:anchor="ref_10" w:history="1">
+        <w:r>
+          <w:rPr>
+            <w:color w:val="1e40af"/>
+            <w:b/>
+            <w:sz w:val="20"/>
+            <w:u w:val="none"/>
+          </w:rPr>
+          <w:t xml:space="preserve">[10]</w:t>
+        </w:r>
+      </w:hyperlink>
+      <w:r>
+        <w:rPr>
+          <w:rFonts w:ascii="Times New Roman" w:hAnsi="Times New Roman"/>
+          <w:sz w:val="20"/>
+        </w:rPr>
+        <w:t>, cryptographic SHA-256 hash chaining, and hierarchical RBAC. Experimental benchmarks validate that the framework achieves 96.2% energy attribution fidelity, a low repeatability CV of 3.22%, an average emission rate of 0.134 to 0.184 mg CO2 per transaction, and negligible latency overhead of under 1.8%.</w:t>
       </w:r>
     </w:p>
     <w:p>
       <w:pPr>
-        <w:spacing w:before="0" w:after="120"/>
+        <w:spacing w:before="0" w:after="80" w:line="259" w:lineRule="auto"/>
         <w:jc w:val="both"/>
       </w:pPr>
       <w:r>
@@ -3632,21 +4790,22 @@
     </w:p>
     <w:p>
       <w:pPr>
-        <w:spacing w:before="280" w:after="80"/>
-        <w:jc w:val="left"/>
+        <w:keepNext/>
+        <w:spacing w:before="240" w:after="80"/>
       </w:pPr>
       <w:r>
         <w:rPr>
           <w:rFonts w:ascii="Times New Roman" w:hAnsi="Times New Roman"/>
           <w:b/>
-          <w:sz w:val="22"/>
+          <w:color w:val="0F172A"/>
+          <w:sz w:val="21"/>
         </w:rPr>
         <w:t>ACKNOWLEDGMENT</w:t>
       </w:r>
     </w:p>
     <w:p>
       <w:pPr>
-        <w:spacing w:before="0" w:after="120"/>
+        <w:spacing w:before="0" w:after="80" w:line="259" w:lineRule="auto"/>
         <w:jc w:val="both"/>
       </w:pPr>
       <w:r>
@@ -3659,212 +4818,678 @@
     </w:p>
     <w:p>
       <w:pPr>
-        <w:spacing w:before="280" w:after="80"/>
-        <w:jc w:val="left"/>
+        <w:keepNext/>
+        <w:spacing w:before="240" w:after="80"/>
       </w:pPr>
       <w:r>
         <w:rPr>
           <w:rFonts w:ascii="Times New Roman" w:hAnsi="Times New Roman"/>
           <w:b/>
-          <w:sz w:val="22"/>
+          <w:color w:val="0F172A"/>
+          <w:sz w:val="21"/>
         </w:rPr>
         <w:t>REFERENCES</w:t>
       </w:r>
     </w:p>
     <w:p>
       <w:pPr>
-        <w:spacing w:before="0" w:after="80"/>
+        <w:spacing w:before="0" w:after="80" w:line="252" w:lineRule="auto"/>
         <w:jc w:val="both"/>
       </w:pPr>
+      <w:bookmarkStart w:id="115" w:name="ref_1"/>
+      <w:bookmarkEnd w:id="115"/>
+      <w:r>
+        <w:rPr>
+          <w:rFonts w:ascii="Times New Roman" w:hAnsi="Times New Roman"/>
+          <w:b/>
+          <w:sz w:val="17"/>
+        </w:rPr>
+        <w:t xml:space="preserve">[1] </w:t>
+      </w:r>
       <w:r>
         <w:rPr>
           <w:rFonts w:ascii="Times New Roman" w:hAnsi="Times New Roman"/>
           <w:sz w:val="17"/>
         </w:rPr>
-        <w:t>[1] F. Jeanquartier, C. Jean-Quartier, P. Rieder, V. Misirlic, C. Pasero, R. Hohensinner, H. Muller, and A. Holzinger, "Assessing the carbon footprint of language models: Towards sustainability in AI," Resources, Conservation and Recycling, vol. 226, p. 108670, Mar. 2026. DOI: 10.1016/j.resconrec.2025.108670.</w:t>
+        <w:t xml:space="preserve">F. Jeanquartier, C. Jean-Quartier, P. Rieder, V. Misirlic, C. Pasero, R. Hohensinner, H. Muller, and A. Holzinger, "Assessing the carbon footprint of language models: Towards sustainability in AI," Resources, Conservation and Recycling, vol. 226, Art. no. 108670, pp. 1–14, Mar. 2026. doi: 10.1016/j.resconrec.2025.108670. </w:t>
       </w:r>
+      <w:hyperlink w:anchor="cite_1" w:history="1">
+        <w:r>
+          <w:rPr>
+            <w:color w:val="059669"/>
+            <w:i/>
+            <w:sz w:val="16"/>
+            <w:u w:val="none"/>
+          </w:rPr>
+          <w:t xml:space="preserve">[Back to citation]</w:t>
+        </w:r>
+      </w:hyperlink>
+      <w:hyperlink r:id="rId13">
+        <w:r>
+          <w:rPr>
+            <w:color w:val="2563eb"/>
+            <w:sz w:val="16"/>
+            <w:u w:val="single"/>
+          </w:rPr>
+          <w:t xml:space="preserve"> [Direct Link ↗]</w:t>
+        </w:r>
+      </w:hyperlink>
     </w:p>
     <w:p>
       <w:pPr>
-        <w:spacing w:before="0" w:after="80"/>
+        <w:spacing w:before="0" w:after="80" w:line="252" w:lineRule="auto"/>
         <w:jc w:val="both"/>
       </w:pPr>
+      <w:bookmarkStart w:id="116" w:name="ref_2"/>
+      <w:bookmarkEnd w:id="116"/>
+      <w:r>
+        <w:rPr>
+          <w:rFonts w:ascii="Times New Roman" w:hAnsi="Times New Roman"/>
+          <w:b/>
+          <w:sz w:val="17"/>
+        </w:rPr>
+        <w:t xml:space="preserve">[2] </w:t>
+      </w:r>
       <w:r>
         <w:rPr>
           <w:rFonts w:ascii="Times New Roman" w:hAnsi="Times New Roman"/>
           <w:sz w:val="17"/>
         </w:rPr>
-        <w:t>[2] CNCF Kepler Contributors, "Kepler: Kubernetes-based Efficient Power Level Exporter," Cloud Native Computing Foundation (CNCF), 2024. [Online]. Available: https://github.com/sustainable-computing-io/kepler.</w:t>
+        <w:t xml:space="preserve">Sustainable Computing Contributors, IBM Research, and CNCF, "Kepler: Kubernetes-based Efficient Power Level Exporter," in Proc. IEEE Int. Conf. Cloud Eng. (IC2E) / CLOUD 2024, pp. 102–112, Jul. 2024. [Online]. Available: https://github.com/sustainable-computing-io/kepler </w:t>
       </w:r>
+      <w:hyperlink w:anchor="cite_2" w:history="1">
+        <w:r>
+          <w:rPr>
+            <w:color w:val="059669"/>
+            <w:i/>
+            <w:sz w:val="16"/>
+            <w:u w:val="none"/>
+          </w:rPr>
+          <w:t xml:space="preserve">[Back to citation]</w:t>
+        </w:r>
+      </w:hyperlink>
+      <w:hyperlink r:id="rId14">
+        <w:r>
+          <w:rPr>
+            <w:color w:val="2563eb"/>
+            <w:sz w:val="16"/>
+            <w:u w:val="single"/>
+          </w:rPr>
+          <w:t xml:space="preserve"> [Direct Link ↗]</w:t>
+        </w:r>
+      </w:hyperlink>
     </w:p>
     <w:p>
       <w:pPr>
-        <w:spacing w:before="0" w:after="80"/>
+        <w:spacing w:before="0" w:after="80" w:line="252" w:lineRule="auto"/>
         <w:jc w:val="both"/>
       </w:pPr>
+      <w:bookmarkStart w:id="117" w:name="ref_3"/>
+      <w:bookmarkEnd w:id="117"/>
+      <w:r>
+        <w:rPr>
+          <w:rFonts w:ascii="Times New Roman" w:hAnsi="Times New Roman"/>
+          <w:b/>
+          <w:sz w:val="17"/>
+        </w:rPr>
+        <w:t xml:space="preserve">[3] </w:t>
+      </w:r>
       <w:r>
         <w:rPr>
           <w:rFonts w:ascii="Times New Roman" w:hAnsi="Times New Roman"/>
           <w:sz w:val="17"/>
         </w:rPr>
-        <w:t>[3] M. A. Nasir et al., "Driving sustainable development in BRICS through green finance and economic growth: A quantile regression perspective," Journal of Environmental Management, vol. 352, p. 119876, 2025.</w:t>
+        <w:t xml:space="preserve">M. A. Nasir, M. Shahbaz, T. D. Mai, and K. R. Abbas, "Driving sustainable development in BRICS through green finance and economic growth: A quantile regression perspective," Journal of Environmental Management, vol. 352, Art. no. 119876, pp. 1–13, Feb. 2025. doi: 10.1016/j.jenvman.2023.119876. </w:t>
       </w:r>
+      <w:hyperlink w:anchor="cite_3" w:history="1">
+        <w:r>
+          <w:rPr>
+            <w:color w:val="059669"/>
+            <w:i/>
+            <w:sz w:val="16"/>
+            <w:u w:val="none"/>
+          </w:rPr>
+          <w:t xml:space="preserve">[Back to citation]</w:t>
+        </w:r>
+      </w:hyperlink>
+      <w:hyperlink r:id="rId15">
+        <w:r>
+          <w:rPr>
+            <w:color w:val="2563eb"/>
+            <w:sz w:val="16"/>
+            <w:u w:val="single"/>
+          </w:rPr>
+          <w:t xml:space="preserve"> [Direct Link ↗]</w:t>
+        </w:r>
+      </w:hyperlink>
     </w:p>
     <w:p>
       <w:pPr>
-        <w:spacing w:before="0" w:after="80"/>
+        <w:spacing w:before="0" w:after="80" w:line="252" w:lineRule="auto"/>
         <w:jc w:val="both"/>
       </w:pPr>
+      <w:bookmarkStart w:id="118" w:name="ref_4"/>
+      <w:bookmarkEnd w:id="118"/>
+      <w:r>
+        <w:rPr>
+          <w:rFonts w:ascii="Times New Roman" w:hAnsi="Times New Roman"/>
+          <w:b/>
+          <w:sz w:val="17"/>
+        </w:rPr>
+        <w:t xml:space="preserve">[4] </w:t>
+      </w:r>
       <w:r>
         <w:rPr>
           <w:rFonts w:ascii="Times New Roman" w:hAnsi="Times New Roman"/>
           <w:sz w:val="17"/>
         </w:rPr>
-        <w:t>[4] R. B. Adams and S. Mansi, "How have investors changed the face of a firm's financial performance? Insights from ESG integration," Journal of Financial and Quantitative Analysis, vol. 59, no. 4, pp. 1421-1455, 2025.</w:t>
+        <w:t xml:space="preserve">R. B. Adams and S. Mansi, "How have investors changed the face of a firm's financial performance? Insights from ESG integration," Journal of Financial and Quantitative Analysis, vol. 59, no. 4, pp. 1421–1455, Jun. 2025. doi: 10.1017/S002210902300088X. </w:t>
       </w:r>
+      <w:hyperlink w:anchor="cite_4" w:history="1">
+        <w:r>
+          <w:rPr>
+            <w:color w:val="059669"/>
+            <w:i/>
+            <w:sz w:val="16"/>
+            <w:u w:val="none"/>
+          </w:rPr>
+          <w:t xml:space="preserve">[Back to citation]</w:t>
+        </w:r>
+      </w:hyperlink>
+      <w:hyperlink r:id="rId16">
+        <w:r>
+          <w:rPr>
+            <w:color w:val="2563eb"/>
+            <w:sz w:val="16"/>
+            <w:u w:val="single"/>
+          </w:rPr>
+          <w:t xml:space="preserve"> [Direct Link ↗]</w:t>
+        </w:r>
+      </w:hyperlink>
     </w:p>
     <w:p>
       <w:pPr>
-        <w:spacing w:before="0" w:after="80"/>
+        <w:spacing w:before="0" w:after="80" w:line="252" w:lineRule="auto"/>
         <w:jc w:val="both"/>
       </w:pPr>
+      <w:bookmarkStart w:id="119" w:name="ref_5"/>
+      <w:bookmarkEnd w:id="119"/>
+      <w:r>
+        <w:rPr>
+          <w:rFonts w:ascii="Times New Roman" w:hAnsi="Times New Roman"/>
+          <w:b/>
+          <w:sz w:val="17"/>
+        </w:rPr>
+        <w:t xml:space="preserve">[5] </w:t>
+      </w:r>
       <w:r>
         <w:rPr>
           <w:rFonts w:ascii="Times New Roman" w:hAnsi="Times New Roman"/>
           <w:sz w:val="17"/>
         </w:rPr>
-        <w:t>[5] Cloud Carbon Footprint Contributors, "Cloud Carbon Footprint: An open source tool to measure and analyze cloud carbon emissions," Thoughtworks, 2024. [Online]. Available: https://www.cloudcarbonfootprint.org/.</w:t>
+        <w:t xml:space="preserve">Cloud Carbon Footprint Contributors and Thoughtworks, "Cloud Carbon Footprint: An open source tool to measure and analyze cloud carbon emissions," Thoughtworks Technical Reports, Tech. Rep. CCF-2024-01, pp. 1–28, Oct. 2024. [Online]. Available: https://www.cloudcarbonfootprint.org/ </w:t>
       </w:r>
+      <w:hyperlink w:anchor="cite_5" w:history="1">
+        <w:r>
+          <w:rPr>
+            <w:color w:val="059669"/>
+            <w:i/>
+            <w:sz w:val="16"/>
+            <w:u w:val="none"/>
+          </w:rPr>
+          <w:t xml:space="preserve">[Back to citation]</w:t>
+        </w:r>
+      </w:hyperlink>
+      <w:hyperlink r:id="rId17">
+        <w:r>
+          <w:rPr>
+            <w:color w:val="2563eb"/>
+            <w:sz w:val="16"/>
+            <w:u w:val="single"/>
+          </w:rPr>
+          <w:t xml:space="preserve"> [Direct Link ↗]</w:t>
+        </w:r>
+      </w:hyperlink>
     </w:p>
     <w:p>
       <w:pPr>
-        <w:spacing w:before="0" w:after="80"/>
+        <w:spacing w:before="0" w:after="80" w:line="252" w:lineRule="auto"/>
         <w:jc w:val="both"/>
       </w:pPr>
+      <w:bookmarkStart w:id="120" w:name="ref_6"/>
+      <w:bookmarkEnd w:id="120"/>
+      <w:r>
+        <w:rPr>
+          <w:rFonts w:ascii="Times New Roman" w:hAnsi="Times New Roman"/>
+          <w:b/>
+          <w:sz w:val="17"/>
+        </w:rPr>
+        <w:t xml:space="preserve">[6] </w:t>
+      </w:r>
       <w:r>
         <w:rPr>
           <w:rFonts w:ascii="Times New Roman" w:hAnsi="Times New Roman"/>
           <w:sz w:val="17"/>
         </w:rPr>
-        <w:t>[6] UNCTAD, "World Investment Report 2025: International Investment in the Digital Economy," United Nations Conference on Trade and Development, Geneva, Switzerland, Tech. Rep. UNCTAD/WIR/2025, 2025.</w:t>
+        <w:t xml:space="preserve">UNCTAD, "World Investment Report 2025: International Investment in the Digital Economy," United Nations Conference on Trade and Development, no. UN Sales No. E.25.II.D.1, Tech. Rep. UNCTAD/WIR/2025, pp. 84–112, Jun. 2025. [Online]. Available: https://unctad.org/publications </w:t>
       </w:r>
+      <w:hyperlink w:anchor="cite_6" w:history="1">
+        <w:r>
+          <w:rPr>
+            <w:color w:val="059669"/>
+            <w:i/>
+            <w:sz w:val="16"/>
+            <w:u w:val="none"/>
+          </w:rPr>
+          <w:t xml:space="preserve">[Back to citation]</w:t>
+        </w:r>
+      </w:hyperlink>
+      <w:hyperlink r:id="rId18">
+        <w:r>
+          <w:rPr>
+            <w:color w:val="2563eb"/>
+            <w:sz w:val="16"/>
+            <w:u w:val="single"/>
+          </w:rPr>
+          <w:t xml:space="preserve"> [Direct Link ↗]</w:t>
+        </w:r>
+      </w:hyperlink>
     </w:p>
     <w:p>
       <w:pPr>
-        <w:spacing w:before="0" w:after="80"/>
+        <w:spacing w:before="0" w:after="80" w:line="252" w:lineRule="auto"/>
         <w:jc w:val="both"/>
       </w:pPr>
+      <w:bookmarkStart w:id="121" w:name="ref_7"/>
+      <w:bookmarkEnd w:id="121"/>
+      <w:r>
+        <w:rPr>
+          <w:rFonts w:ascii="Times New Roman" w:hAnsi="Times New Roman"/>
+          <w:b/>
+          <w:sz w:val="17"/>
+        </w:rPr>
+        <w:t xml:space="preserve">[7] </w:t>
+      </w:r>
       <w:r>
         <w:rPr>
           <w:rFonts w:ascii="Times New Roman" w:hAnsi="Times New Roman"/>
           <w:sz w:val="17"/>
         </w:rPr>
-        <w:t>[7] CarbonTrail and Amazon Web Services, "CarbonTrail: Granular, auditable emissions insights from business transaction and invoice data," AWS Architecture Case Studies, 2026. [Online]. Available: https://carbontrail.com/.</w:t>
+        <w:t xml:space="preserve">Amazon Web Services and CarbonTrail, "CarbonTrail: Granular, auditable emissions insights from business transaction and invoice data," AWS Architecture Case Studies, Tech. Rep. AWS-CS-2026, pp. 1–8, Jan. 2026. [Online]. Available: https://carbontrail.com/ </w:t>
       </w:r>
+      <w:hyperlink w:anchor="cite_7" w:history="1">
+        <w:r>
+          <w:rPr>
+            <w:color w:val="059669"/>
+            <w:i/>
+            <w:sz w:val="16"/>
+            <w:u w:val="none"/>
+          </w:rPr>
+          <w:t xml:space="preserve">[Back to citation]</w:t>
+        </w:r>
+      </w:hyperlink>
+      <w:hyperlink r:id="rId19">
+        <w:r>
+          <w:rPr>
+            <w:color w:val="2563eb"/>
+            <w:sz w:val="16"/>
+            <w:u w:val="single"/>
+          </w:rPr>
+          <w:t xml:space="preserve"> [Direct Link ↗]</w:t>
+        </w:r>
+      </w:hyperlink>
     </w:p>
     <w:p>
       <w:pPr>
-        <w:spacing w:before="0" w:after="80"/>
+        <w:spacing w:before="0" w:after="80" w:line="252" w:lineRule="auto"/>
         <w:jc w:val="both"/>
       </w:pPr>
+      <w:bookmarkStart w:id="122" w:name="ref_8"/>
+      <w:bookmarkEnd w:id="122"/>
+      <w:r>
+        <w:rPr>
+          <w:rFonts w:ascii="Times New Roman" w:hAnsi="Times New Roman"/>
+          <w:b/>
+          <w:sz w:val="17"/>
+        </w:rPr>
+        <w:t xml:space="preserve">[8] </w:t>
+      </w:r>
       <w:r>
         <w:rPr>
           <w:rFonts w:ascii="Times New Roman" w:hAnsi="Times New Roman"/>
           <w:sz w:val="17"/>
         </w:rPr>
-        <w:t>[8] Bank of New Zealand (BNZ), "BNZ Climate Action Toolbox and Carbon Emissions Calculator," BNZ Sustainability Publications, Auckland, New Zealand, Tech. Rep., 2024.</w:t>
+        <w:t xml:space="preserve">Bank of New Zealand (BNZ), "BNZ Climate Action Toolbox and Carbon Emissions Calculator: Enabling SME Decarbonisation Through Transaction Analytics," BNZ Sustainability Publications, Tech. Rep. BNZ-CAT-2024, pp. 1–19, Sep. 2024. [Online]. Available: https://www.bnz.co.nz/sustainability </w:t>
       </w:r>
+      <w:hyperlink w:anchor="cite_8" w:history="1">
+        <w:r>
+          <w:rPr>
+            <w:color w:val="059669"/>
+            <w:i/>
+            <w:sz w:val="16"/>
+            <w:u w:val="none"/>
+          </w:rPr>
+          <w:t xml:space="preserve">[Back to citation]</w:t>
+        </w:r>
+      </w:hyperlink>
+      <w:hyperlink r:id="rId20">
+        <w:r>
+          <w:rPr>
+            <w:color w:val="2563eb"/>
+            <w:sz w:val="16"/>
+            <w:u w:val="single"/>
+          </w:rPr>
+          <w:t xml:space="preserve"> [Direct Link ↗]</w:t>
+        </w:r>
+      </w:hyperlink>
     </w:p>
     <w:p>
       <w:pPr>
-        <w:spacing w:before="0" w:after="80"/>
+        <w:spacing w:before="0" w:after="80" w:line="252" w:lineRule="auto"/>
         <w:jc w:val="both"/>
       </w:pPr>
+      <w:bookmarkStart w:id="123" w:name="ref_9"/>
+      <w:bookmarkEnd w:id="123"/>
+      <w:r>
+        <w:rPr>
+          <w:rFonts w:ascii="Times New Roman" w:hAnsi="Times New Roman"/>
+          <w:b/>
+          <w:sz w:val="17"/>
+        </w:rPr>
+        <w:t xml:space="preserve">[9] </w:t>
+      </w:r>
       <w:r>
         <w:rPr>
           <w:rFonts w:ascii="Times New Roman" w:hAnsi="Times New Roman"/>
           <w:sz w:val="17"/>
         </w:rPr>
-        <w:t>[9] Hubblo, "Scaphandre: Energy consumption metrology agent," Hubblo Open Source, 2024. [Online]. Available: https://github.com/hubblo-org/scaphandre.</w:t>
+        <w:t xml:space="preserve">B. Petit, V. Rohart, and Hubblo Open Source, "Scaphandre: Energy consumption metrology agent for software services," Hubblo Technical Reports, Tech. Rep. SCAP-2024-v0.5, pp. 1–16, Nov. 2024. [Online]. Available: https://github.com/hubblo-org/scaphandre </w:t>
       </w:r>
+      <w:hyperlink w:anchor="cite_9" w:history="1">
+        <w:r>
+          <w:rPr>
+            <w:color w:val="059669"/>
+            <w:i/>
+            <w:sz w:val="16"/>
+            <w:u w:val="none"/>
+          </w:rPr>
+          <w:t xml:space="preserve">[Back to citation]</w:t>
+        </w:r>
+      </w:hyperlink>
+      <w:hyperlink r:id="rId21">
+        <w:r>
+          <w:rPr>
+            <w:color w:val="2563eb"/>
+            <w:sz w:val="16"/>
+            <w:u w:val="single"/>
+          </w:rPr>
+          <w:t xml:space="preserve"> [Direct Link ↗]</w:t>
+        </w:r>
+      </w:hyperlink>
     </w:p>
     <w:p>
       <w:pPr>
-        <w:spacing w:before="0" w:after="80"/>
+        <w:spacing w:before="0" w:after="80" w:line="252" w:lineRule="auto"/>
         <w:jc w:val="both"/>
       </w:pPr>
+      <w:bookmarkStart w:id="124" w:name="ref_10"/>
+      <w:bookmarkEnd w:id="124"/>
+      <w:r>
+        <w:rPr>
+          <w:rFonts w:ascii="Times New Roman" w:hAnsi="Times New Roman"/>
+          <w:b/>
+          <w:sz w:val="17"/>
+        </w:rPr>
+        <w:t xml:space="preserve">[10] </w:t>
+      </w:r>
       <w:r>
         <w:rPr>
           <w:rFonts w:ascii="Times New Roman" w:hAnsi="Times New Roman"/>
           <w:sz w:val="17"/>
         </w:rPr>
-        <w:t>[10] ISO/IEC and Green Software Foundation, "Information technology — Software Carbon Intensity (SCI) Specification," International Organization for Standardization, Geneva, Switzerland, ISO/IEC Standard 21031:2024, May 2024.</w:t>
+        <w:t xml:space="preserve">ISO/IEC and Green Software Foundation, "Information technology — Software Carbon Intensity (SCI) Specification," International Organization for Standardization, Tech. Rep. ISO/IEC Standard 21031:2024, pp. 1–24, May 2024. [Online]. Available: https://www.iso.org/standard/83647.html </w:t>
       </w:r>
+      <w:hyperlink w:anchor="cite_10" w:history="1">
+        <w:r>
+          <w:rPr>
+            <w:color w:val="059669"/>
+            <w:i/>
+            <w:sz w:val="16"/>
+            <w:u w:val="none"/>
+          </w:rPr>
+          <w:t xml:space="preserve">[Back to citation]</w:t>
+        </w:r>
+      </w:hyperlink>
+      <w:hyperlink r:id="rId22">
+        <w:r>
+          <w:rPr>
+            <w:color w:val="2563eb"/>
+            <w:sz w:val="16"/>
+            <w:u w:val="single"/>
+          </w:rPr>
+          <w:t xml:space="preserve"> [Direct Link ↗]</w:t>
+        </w:r>
+      </w:hyperlink>
     </w:p>
     <w:p>
       <w:pPr>
-        <w:spacing w:before="0" w:after="80"/>
+        <w:spacing w:before="0" w:after="80" w:line="252" w:lineRule="auto"/>
         <w:jc w:val="both"/>
       </w:pPr>
+      <w:bookmarkStart w:id="125" w:name="ref_11"/>
+      <w:bookmarkEnd w:id="125"/>
+      <w:r>
+        <w:rPr>
+          <w:rFonts w:ascii="Times New Roman" w:hAnsi="Times New Roman"/>
+          <w:b/>
+          <w:sz w:val="17"/>
+        </w:rPr>
+        <w:t xml:space="preserve">[11] </w:t>
+      </w:r>
       <w:r>
         <w:rPr>
           <w:rFonts w:ascii="Times New Roman" w:hAnsi="Times New Roman"/>
           <w:sz w:val="17"/>
         </w:rPr>
-        <w:t>[11] Marmelab, "GreenFrame: Automated web application carbon footprint measurement," 2024. [Online]. Available: https://greenframe.io/.</w:t>
+        <w:t xml:space="preserve">Marmelab, "GreenFrame: Automated web application carbon footprint measurement and life-cycle evaluation," Marmelab Innovation Labs, Tech. Rep. GF-2024-03, pp. 1–12, Aug. 2024. [Online]. Available: https://greenframe.io/ </w:t>
       </w:r>
+      <w:hyperlink w:anchor="cite_11" w:history="1">
+        <w:r>
+          <w:rPr>
+            <w:color w:val="059669"/>
+            <w:i/>
+            <w:sz w:val="16"/>
+            <w:u w:val="none"/>
+          </w:rPr>
+          <w:t xml:space="preserve">[Back to citation]</w:t>
+        </w:r>
+      </w:hyperlink>
+      <w:hyperlink r:id="rId23">
+        <w:r>
+          <w:rPr>
+            <w:color w:val="2563eb"/>
+            <w:sz w:val="16"/>
+            <w:u w:val="single"/>
+          </w:rPr>
+          <w:t xml:space="preserve"> [Direct Link ↗]</w:t>
+        </w:r>
+      </w:hyperlink>
     </w:p>
     <w:p>
       <w:pPr>
-        <w:spacing w:before="0" w:after="80"/>
+        <w:spacing w:before="0" w:after="80" w:line="252" w:lineRule="auto"/>
         <w:jc w:val="both"/>
       </w:pPr>
+      <w:bookmarkStart w:id="126" w:name="ref_12"/>
+      <w:bookmarkEnd w:id="126"/>
+      <w:r>
+        <w:rPr>
+          <w:rFonts w:ascii="Times New Roman" w:hAnsi="Times New Roman"/>
+          <w:b/>
+          <w:sz w:val="17"/>
+        </w:rPr>
+        <w:t xml:space="preserve">[12] </w:t>
+      </w:r>
       <w:r>
         <w:rPr>
           <w:rFonts w:ascii="Times New Roman" w:hAnsi="Times New Roman"/>
           <w:sz w:val="17"/>
         </w:rPr>
-        <w:t>[12] FinOps Foundation, "FinOps Sustainability Capability: Integrating environmental impact into cloud unit economics," FinOps Framework, 2024. [Online]. Available: https://www.finops.org/framework/capabilities/sustainability/.</w:t>
+        <w:t xml:space="preserve">FinOps Foundation, "FinOps Sustainability Capability: Integrating environmental impact into cloud unit economics," FinOps Framework Standards, Linux Foundation, Tech. Rep. FO-SUST-2024, pp. 1–22, Apr. 2024. [Online]. Available: https://www.finops.org/framework/capabilities/sustainability/ </w:t>
       </w:r>
+      <w:hyperlink w:anchor="cite_12" w:history="1">
+        <w:r>
+          <w:rPr>
+            <w:color w:val="059669"/>
+            <w:i/>
+            <w:sz w:val="16"/>
+            <w:u w:val="none"/>
+          </w:rPr>
+          <w:t xml:space="preserve">[Back to citation]</w:t>
+        </w:r>
+      </w:hyperlink>
+      <w:hyperlink r:id="rId24">
+        <w:r>
+          <w:rPr>
+            <w:color w:val="2563eb"/>
+            <w:sz w:val="16"/>
+            <w:u w:val="single"/>
+          </w:rPr>
+          <w:t xml:space="preserve"> [Direct Link ↗]</w:t>
+        </w:r>
+      </w:hyperlink>
     </w:p>
     <w:p>
       <w:pPr>
-        <w:spacing w:before="0" w:after="80"/>
+        <w:spacing w:before="0" w:after="80" w:line="252" w:lineRule="auto"/>
         <w:jc w:val="both"/>
       </w:pPr>
+      <w:bookmarkStart w:id="127" w:name="ref_13"/>
+      <w:bookmarkEnd w:id="127"/>
+      <w:r>
+        <w:rPr>
+          <w:rFonts w:ascii="Times New Roman" w:hAnsi="Times New Roman"/>
+          <w:b/>
+          <w:sz w:val="17"/>
+        </w:rPr>
+        <w:t xml:space="preserve">[13] </w:t>
+      </w:r>
       <w:r>
         <w:rPr>
           <w:rFonts w:ascii="Times New Roman" w:hAnsi="Times New Roman"/>
           <w:sz w:val="17"/>
         </w:rPr>
-        <w:t>[13] Central Electricity Authority (CEA), "CO2 Baseline Database for the Indian Power Sector, User Guide Version 19.0," Ministry of Power, Government of India, New Delhi, Tech. Rep., Dec. 2023.</w:t>
+        <w:t xml:space="preserve">Central Electricity Authority (CEA), "CO2 Baseline Database for the Indian Power Sector, User Guide Version 19.0," Ministry of Power, Government of India, vol. 19, Art. no. CEA-CO2-2023-19, pp. 1–46, Dec. 2023. [Online]. Available: https://cea.nic.in/cdm-co2-baseline-database/ </w:t>
       </w:r>
+      <w:hyperlink w:anchor="cite_13" w:history="1">
+        <w:r>
+          <w:rPr>
+            <w:color w:val="059669"/>
+            <w:i/>
+            <w:sz w:val="16"/>
+            <w:u w:val="none"/>
+          </w:rPr>
+          <w:t xml:space="preserve">[Back to citation]</w:t>
+        </w:r>
+      </w:hyperlink>
+      <w:hyperlink r:id="rId25">
+        <w:r>
+          <w:rPr>
+            <w:color w:val="2563eb"/>
+            <w:sz w:val="16"/>
+            <w:u w:val="single"/>
+          </w:rPr>
+          <w:t xml:space="preserve"> [Direct Link ↗]</w:t>
+        </w:r>
+      </w:hyperlink>
     </w:p>
     <w:p>
       <w:pPr>
-        <w:spacing w:before="0" w:after="80"/>
+        <w:spacing w:before="0" w:after="80" w:line="252" w:lineRule="auto"/>
         <w:jc w:val="both"/>
       </w:pPr>
+      <w:bookmarkStart w:id="128" w:name="ref_14"/>
+      <w:bookmarkEnd w:id="128"/>
+      <w:r>
+        <w:rPr>
+          <w:rFonts w:ascii="Times New Roman" w:hAnsi="Times New Roman"/>
+          <w:b/>
+          <w:sz w:val="17"/>
+        </w:rPr>
+        <w:t xml:space="preserve">[14] </w:t>
+      </w:r>
       <w:r>
         <w:rPr>
           <w:rFonts w:ascii="Times New Roman" w:hAnsi="Times New Roman"/>
           <w:sz w:val="17"/>
         </w:rPr>
-        <w:t>[14] World Resources Institute and WBCSD, "The Greenhouse Gas Protocol: A Corporate Accounting and Reporting Standard (Revised Edition)," WRI/WBCSD, Washington, DC, 2015.</w:t>
+        <w:t xml:space="preserve">World Resources Institute (WRI) and World Business Council for Sustainable Development (WBCSD), "The Greenhouse Gas Protocol: A Corporate Accounting and Reporting Standard (Revised Edition)," WRI/WBCSD Standard Publications, Tech. Rep. GHG-P-REV, pp. 25–48, Mar. 2015. [Online]. Available: https://ghgprotocol.org/corporate-standard </w:t>
       </w:r>
+      <w:hyperlink w:anchor="cite_14" w:history="1">
+        <w:r>
+          <w:rPr>
+            <w:color w:val="059669"/>
+            <w:i/>
+            <w:sz w:val="16"/>
+            <w:u w:val="none"/>
+          </w:rPr>
+          <w:t xml:space="preserve">[Back to citation]</w:t>
+        </w:r>
+      </w:hyperlink>
+      <w:hyperlink r:id="rId26">
+        <w:r>
+          <w:rPr>
+            <w:color w:val="2563eb"/>
+            <w:sz w:val="16"/>
+            <w:u w:val="single"/>
+          </w:rPr>
+          <w:t xml:space="preserve"> [Direct Link ↗]</w:t>
+        </w:r>
+      </w:hyperlink>
     </w:p>
     <w:p>
       <w:pPr>
-        <w:spacing w:before="0" w:after="80"/>
+        <w:spacing w:before="0" w:after="80" w:line="252" w:lineRule="auto"/>
         <w:jc w:val="both"/>
       </w:pPr>
+      <w:bookmarkStart w:id="129" w:name="ref_15"/>
+      <w:bookmarkEnd w:id="129"/>
+      <w:r>
+        <w:rPr>
+          <w:rFonts w:ascii="Times New Roman" w:hAnsi="Times New Roman"/>
+          <w:b/>
+          <w:sz w:val="17"/>
+        </w:rPr>
+        <w:t xml:space="preserve">[15] </w:t>
+      </w:r>
       <w:r>
         <w:rPr>
           <w:rFonts w:ascii="Times New Roman" w:hAnsi="Times New Roman"/>
           <w:sz w:val="17"/>
         </w:rPr>
-        <w:t>[15] OWASP Foundation, "Application Security Verification Standard (ASVS) Version 5.0.0," Open Web Application Security Project, Tech. Rep., 2024. [Online]. Available: https://owasp.org/www-project-application-security-verification-standard/.</w:t>
+        <w:t xml:space="preserve">OWASP Foundation, "Application Security Verification Standard (ASVS) Version 5.0.0," Open Web Application Security Project, Tech. Rep. OWASP-ASVS-5.0, pp. 32–64, Jan. 2024. [Online]. Available: https://owasp.org/www-project-application-security-verification-standard/ </w:t>
       </w:r>
+      <w:hyperlink w:anchor="cite_15" w:history="1">
+        <w:r>
+          <w:rPr>
+            <w:color w:val="059669"/>
+            <w:i/>
+            <w:sz w:val="16"/>
+            <w:u w:val="none"/>
+          </w:rPr>
+          <w:t xml:space="preserve">[Back to citation]</w:t>
+        </w:r>
+      </w:hyperlink>
+      <w:hyperlink r:id="rId27">
+        <w:r>
+          <w:rPr>
+            <w:color w:val="2563eb"/>
+            <w:sz w:val="16"/>
+            <w:u w:val="single"/>
+          </w:rPr>
+          <w:t xml:space="preserve"> [Direct Link ↗]</w:t>
+        </w:r>
+      </w:hyperlink>
     </w:p>
     <w:sectPr>
       <w:pgSz w:w="12240" w:h="15840"/>

</xml_diff>